<commit_message>
Add server search ordering and duplicate prevention
</commit_message>
<xml_diff>
--- a/모바일웹서비스 프로젝트_공통평가 01_수행 결과 보고서.docx
+++ b/모바일웹서비스 프로젝트_공통평가 01_수행 결과 보고서.docx
@@ -12,7 +12,6 @@
           <w:b/>
           <w:sz w:val="28"/>
           <w:szCs w:val="28"/>
-          <w:lang w:eastAsia="ko-KR"/>
         </w:rPr>
       </w:pPr>
       <w:r>
@@ -21,7 +20,6 @@
           <w:b/>
           <w:sz w:val="28"/>
           <w:szCs w:val="28"/>
-          <w:lang w:eastAsia="ko-KR"/>
         </w:rPr>
         <w:t xml:space="preserve">2026년 2학기 </w:t>
       </w:r>
@@ -31,9 +29,28 @@
           <w:b/>
           <w:sz w:val="28"/>
           <w:szCs w:val="28"/>
-          <w:lang w:eastAsia="ko-KR"/>
         </w:rPr>
-        <w:t>모바일/웹서비스 프로젝트 공통평가 01</w:t>
+        <w:t>모바일/</w:t>
+      </w:r>
+      <w:proofErr w:type="spellStart"/>
+      <w:r>
+        <w:rPr>
+          <w:rFonts w:hint="eastAsia"/>
+          <w:b/>
+          <w:sz w:val="28"/>
+          <w:szCs w:val="28"/>
+        </w:rPr>
+        <w:t>웹서비스</w:t>
+      </w:r>
+      <w:proofErr w:type="spellEnd"/>
+      <w:r>
+        <w:rPr>
+          <w:rFonts w:hint="eastAsia"/>
+          <w:b/>
+          <w:sz w:val="28"/>
+          <w:szCs w:val="28"/>
+        </w:rPr>
+        <w:t xml:space="preserve"> 프로젝트 공통평가 01</w:t>
       </w:r>
     </w:p>
     <w:p>
@@ -46,7 +63,6 @@
           <w:b/>
           <w:sz w:val="28"/>
           <w:szCs w:val="28"/>
-          <w:lang w:eastAsia="ko-KR"/>
         </w:rPr>
       </w:pPr>
       <w:r>
@@ -55,7 +71,6 @@
           <w:b/>
           <w:sz w:val="28"/>
           <w:szCs w:val="28"/>
-          <w:lang w:eastAsia="ko-KR"/>
         </w:rPr>
         <w:t>수행 결과 보고서</w:t>
       </w:r>
@@ -67,22 +82,30 @@
         <w:jc w:val="left"/>
         <w:outlineLvl w:val="0"/>
         <w:rPr>
-          <w:rFonts w:hint="eastAsia"/>
           <w:b/>
           <w:sz w:val="28"/>
           <w:szCs w:val="28"/>
-          <w:lang w:eastAsia="ko-KR"/>
         </w:rPr>
       </w:pPr>
+      <w:proofErr w:type="gramStart"/>
       <w:r>
         <w:rPr>
           <w:rFonts w:hint="eastAsia"/>
           <w:b/>
           <w:sz w:val="28"/>
           <w:szCs w:val="28"/>
-          <w:lang w:eastAsia="ko-KR"/>
         </w:rPr>
-        <w:t xml:space="preserve">학번 : </w:t>
+        <w:t>학번 :</w:t>
+      </w:r>
+      <w:proofErr w:type="gramEnd"/>
+      <w:r>
+        <w:rPr>
+          <w:rFonts w:hint="eastAsia"/>
+          <w:b/>
+          <w:sz w:val="28"/>
+          <w:szCs w:val="28"/>
+        </w:rPr>
+        <w:t xml:space="preserve"> </w:t>
       </w:r>
       <w:r>
         <w:rPr>
@@ -90,7 +113,6 @@
           <w:b/>
           <w:sz w:val="28"/>
           <w:szCs w:val="28"/>
-          <w:lang w:eastAsia="ko-KR"/>
         </w:rPr>
         <w:t>2022105460</w:t>
       </w:r>
@@ -102,20 +124,18 @@
         <w:jc w:val="left"/>
         <w:outlineLvl w:val="0"/>
         <w:rPr>
-          <w:rFonts w:hint="eastAsia"/>
           <w:b/>
           <w:sz w:val="28"/>
           <w:szCs w:val="28"/>
-          <w:lang w:eastAsia="ko-KR"/>
         </w:rPr>
       </w:pPr>
+      <w:proofErr w:type="gramStart"/>
       <w:r>
         <w:rPr>
           <w:rFonts w:hint="eastAsia"/>
           <w:b/>
           <w:sz w:val="28"/>
           <w:szCs w:val="28"/>
-          <w:lang w:eastAsia="ko-KR"/>
         </w:rPr>
         <w:t>이름</w:t>
       </w:r>
@@ -125,9 +145,18 @@
           <w:b/>
           <w:sz w:val="28"/>
           <w:szCs w:val="28"/>
-          <w:lang w:eastAsia="ko-KR"/>
         </w:rPr>
-        <w:t xml:space="preserve"> : </w:t>
+        <w:t xml:space="preserve"> :</w:t>
+      </w:r>
+      <w:proofErr w:type="gramEnd"/>
+      <w:r>
+        <w:rPr>
+          <w:rFonts w:hint="eastAsia"/>
+          <w:b/>
+          <w:sz w:val="28"/>
+          <w:szCs w:val="28"/>
+        </w:rPr>
+        <w:t xml:space="preserve"> </w:t>
       </w:r>
       <w:r>
         <w:rPr>
@@ -135,7 +164,6 @@
           <w:b/>
           <w:sz w:val="28"/>
           <w:szCs w:val="28"/>
-          <w:lang w:eastAsia="ko-KR"/>
         </w:rPr>
         <w:t>박재우</w:t>
       </w:r>
@@ -150,7 +178,6 @@
           <w:rFonts w:ascii="바탕" w:eastAsia="바탕" w:hAnsi="바탕"/>
           <w:sz w:val="28"/>
           <w:szCs w:val="28"/>
-          <w:lang w:eastAsia="ko-KR"/>
         </w:rPr>
       </w:pPr>
     </w:p>
@@ -168,7 +195,70 @@
           <w:sz w:val="18"/>
           <w:szCs w:val="18"/>
         </w:rPr>
-        <w:t>[적/부판정 범례] ○:적합, ×:부적합, △:점검</w:t>
+        <w:t>[적/</w:t>
+      </w:r>
+      <w:proofErr w:type="spellStart"/>
+      <w:r>
+        <w:rPr>
+          <w:rFonts w:hint="eastAsia"/>
+          <w:sz w:val="18"/>
+          <w:szCs w:val="18"/>
+        </w:rPr>
+        <w:t>부판정</w:t>
+      </w:r>
+      <w:proofErr w:type="spellEnd"/>
+      <w:r>
+        <w:rPr>
+          <w:rFonts w:hint="eastAsia"/>
+          <w:sz w:val="18"/>
+          <w:szCs w:val="18"/>
+        </w:rPr>
+        <w:t xml:space="preserve"> 범례] </w:t>
+      </w:r>
+      <w:proofErr w:type="gramStart"/>
+      <w:r>
+        <w:rPr>
+          <w:rFonts w:hint="eastAsia"/>
+          <w:sz w:val="18"/>
+          <w:szCs w:val="18"/>
+        </w:rPr>
+        <w:t>○:적합</w:t>
+      </w:r>
+      <w:proofErr w:type="gramEnd"/>
+      <w:r>
+        <w:rPr>
+          <w:rFonts w:hint="eastAsia"/>
+          <w:sz w:val="18"/>
+          <w:szCs w:val="18"/>
+        </w:rPr>
+        <w:t xml:space="preserve">, </w:t>
+      </w:r>
+      <w:proofErr w:type="gramStart"/>
+      <w:r>
+        <w:rPr>
+          <w:rFonts w:hint="eastAsia"/>
+          <w:sz w:val="18"/>
+          <w:szCs w:val="18"/>
+        </w:rPr>
+        <w:t>×:부적합</w:t>
+      </w:r>
+      <w:proofErr w:type="gramEnd"/>
+      <w:r>
+        <w:rPr>
+          <w:rFonts w:hint="eastAsia"/>
+          <w:sz w:val="18"/>
+          <w:szCs w:val="18"/>
+        </w:rPr>
+        <w:t xml:space="preserve">, </w:t>
+      </w:r>
+      <w:proofErr w:type="gramStart"/>
+      <w:r>
+        <w:rPr>
+          <w:rFonts w:hint="eastAsia"/>
+          <w:sz w:val="18"/>
+          <w:szCs w:val="18"/>
+        </w:rPr>
+        <w:t>△:점검</w:t>
       </w:r>
       <w:r>
         <w:rPr>
@@ -177,48 +267,35 @@
         </w:rPr>
         <w:t>제외</w:t>
       </w:r>
+      <w:proofErr w:type="gramEnd"/>
       <w:r>
         <w:rPr>
           <w:rFonts w:hint="eastAsia"/>
           <w:sz w:val="18"/>
           <w:szCs w:val="18"/>
         </w:rPr>
-        <w:t>, N/A:해당없음</w:t>
+        <w:t>, N/</w:t>
       </w:r>
-    </w:p>
-    <w:p>
-      <w:pPr>
-        <w:jc w:val="right"/>
-        <w:rPr>
-          <w:sz w:val="18"/>
-          <w:szCs w:val="18"/>
-        </w:rPr>
-      </w:pPr>
+      <w:proofErr w:type="gramStart"/>
       <w:r>
         <w:rPr>
           <w:rFonts w:hint="eastAsia"/>
           <w:sz w:val="18"/>
           <w:szCs w:val="18"/>
         </w:rPr>
-        <w:t>첨부 그림은 모두 문서에 포함하는 형식으로 저장 할 것</w:t>
+        <w:t>A:</w:t>
       </w:r>
-    </w:p>
-    <w:p>
-      <w:pPr>
-        <w:jc w:val="right"/>
-        <w:rPr>
-          <w:sz w:val="18"/>
-          <w:szCs w:val="18"/>
-        </w:rPr>
-      </w:pPr>
+      <w:proofErr w:type="spellStart"/>
       <w:r>
         <w:rPr>
           <w:rFonts w:hint="eastAsia"/>
           <w:sz w:val="18"/>
           <w:szCs w:val="18"/>
         </w:rPr>
-        <w:t>첨부 그림은 해상도를 줄이지 말고 임의로 키워 화면의 내용을 확인 가능하도록 첨부 할 것</w:t>
+        <w:t>해당없음</w:t>
       </w:r>
+      <w:proofErr w:type="spellEnd"/>
+      <w:proofErr w:type="gramEnd"/>
     </w:p>
     <w:p>
       <w:pPr>
@@ -234,14 +311,118 @@
           <w:sz w:val="18"/>
           <w:szCs w:val="18"/>
         </w:rPr>
-        <w:t xml:space="preserve">강의자료(1) : </w:t>
+        <w:t xml:space="preserve">첨부 그림은 모두 문서에 포함하는 형식으로 </w:t>
+      </w:r>
+      <w:proofErr w:type="gramStart"/>
+      <w:r>
+        <w:rPr>
+          <w:rFonts w:hint="eastAsia"/>
+          <w:sz w:val="18"/>
+          <w:szCs w:val="18"/>
+        </w:rPr>
+        <w:t>저장 할</w:t>
+      </w:r>
+      <w:proofErr w:type="gramEnd"/>
+      <w:r>
+        <w:rPr>
+          <w:rFonts w:hint="eastAsia"/>
+          <w:sz w:val="18"/>
+          <w:szCs w:val="18"/>
+        </w:rPr>
+        <w:t xml:space="preserve"> 것</w:t>
+      </w:r>
+    </w:p>
+    <w:p>
+      <w:pPr>
+        <w:jc w:val="right"/>
+        <w:rPr>
+          <w:sz w:val="18"/>
+          <w:szCs w:val="18"/>
+        </w:rPr>
+      </w:pPr>
+      <w:r>
+        <w:rPr>
+          <w:rFonts w:hint="eastAsia"/>
+          <w:sz w:val="18"/>
+          <w:szCs w:val="18"/>
+        </w:rPr>
+        <w:t xml:space="preserve">첨부 그림은 해상도를 줄이지 말고 임의로 키워 화면의 내용을 확인 가능하도록 </w:t>
+      </w:r>
+      <w:proofErr w:type="gramStart"/>
+      <w:r>
+        <w:rPr>
+          <w:rFonts w:hint="eastAsia"/>
+          <w:sz w:val="18"/>
+          <w:szCs w:val="18"/>
+        </w:rPr>
+        <w:t>첨부 할</w:t>
+      </w:r>
+      <w:proofErr w:type="gramEnd"/>
+      <w:r>
+        <w:rPr>
+          <w:rFonts w:hint="eastAsia"/>
+          <w:sz w:val="18"/>
+          <w:szCs w:val="18"/>
+        </w:rPr>
+        <w:t xml:space="preserve"> 것</w:t>
+      </w:r>
+    </w:p>
+    <w:p>
+      <w:pPr>
+        <w:jc w:val="right"/>
+        <w:rPr>
+          <w:sz w:val="18"/>
+          <w:szCs w:val="18"/>
+        </w:rPr>
+      </w:pPr>
+      <w:r>
+        <w:rPr>
+          <w:rFonts w:hint="eastAsia"/>
+          <w:sz w:val="18"/>
+          <w:szCs w:val="18"/>
+        </w:rPr>
+        <w:t>강의자료(1</w:t>
+      </w:r>
+      <w:proofErr w:type="gramStart"/>
+      <w:r>
+        <w:rPr>
+          <w:rFonts w:hint="eastAsia"/>
+          <w:sz w:val="18"/>
+          <w:szCs w:val="18"/>
+        </w:rPr>
+        <w:t>) :</w:t>
+      </w:r>
+      <w:proofErr w:type="gramEnd"/>
+      <w:r>
+        <w:rPr>
+          <w:rFonts w:hint="eastAsia"/>
+          <w:sz w:val="18"/>
+          <w:szCs w:val="18"/>
+        </w:rPr>
+        <w:t xml:space="preserve"> </w:t>
       </w:r>
       <w:r>
         <w:rPr>
           <w:sz w:val="18"/>
           <w:szCs w:val="18"/>
         </w:rPr>
-        <w:t>05_모바일 앱으로 사용하는 기본포토블로그_v1.1.pdf</w:t>
+        <w:t xml:space="preserve">05_모바일 앱으로 사용하는 </w:t>
+      </w:r>
+      <w:proofErr w:type="spellStart"/>
+      <w:r>
+        <w:rPr>
+          <w:sz w:val="18"/>
+          <w:szCs w:val="18"/>
+        </w:rPr>
+        <w:t>기본포토블로그</w:t>
+      </w:r>
+      <w:proofErr w:type="spellEnd"/>
+      <w:r>
+        <w:rPr>
+          <w:sz w:val="18"/>
+          <w:szCs w:val="18"/>
+        </w:rPr>
+        <w:t>_v1.1.pdf</w:t>
       </w:r>
     </w:p>
     <w:p>
@@ -258,7 +439,25 @@
           <w:sz w:val="18"/>
           <w:szCs w:val="18"/>
         </w:rPr>
-        <w:t xml:space="preserve">강의자료(2) : </w:t>
+        <w:t>강의자료(2</w:t>
+      </w:r>
+      <w:proofErr w:type="gramStart"/>
+      <w:r>
+        <w:rPr>
+          <w:rFonts w:hint="eastAsia"/>
+          <w:sz w:val="18"/>
+          <w:szCs w:val="18"/>
+        </w:rPr>
+        <w:t>) :</w:t>
+      </w:r>
+      <w:proofErr w:type="gramEnd"/>
+      <w:r>
+        <w:rPr>
+          <w:rFonts w:hint="eastAsia"/>
+          <w:sz w:val="18"/>
+          <w:szCs w:val="18"/>
+        </w:rPr>
+        <w:t xml:space="preserve"> </w:t>
       </w:r>
       <w:r>
         <w:rPr>
@@ -617,6 +816,7 @@
                 <w:szCs w:val="12"/>
               </w:rPr>
             </w:pPr>
+            <w:proofErr w:type="spellStart"/>
             <w:r>
               <w:rPr>
                 <w:rFonts w:hint="eastAsia"/>
@@ -628,6 +828,7 @@
               </w:rPr>
               <w:t>관련증빙</w:t>
             </w:r>
+            <w:proofErr w:type="spellEnd"/>
           </w:p>
         </w:tc>
       </w:tr>
@@ -671,6 +872,7 @@
                 <w:szCs w:val="12"/>
               </w:rPr>
             </w:pPr>
+            <w:proofErr w:type="spellStart"/>
             <w:r>
               <w:rPr>
                 <w:rFonts w:hint="eastAsia"/>
@@ -679,6 +881,7 @@
               </w:rPr>
               <w:t>제출문</w:t>
             </w:r>
+            <w:proofErr w:type="spellEnd"/>
           </w:p>
         </w:tc>
         <w:tc>
@@ -746,12 +949,30 @@
               </w:rPr>
               <w:t xml:space="preserve">- </w:t>
             </w:r>
+            <w:proofErr w:type="spellStart"/>
+            <w:proofErr w:type="gramStart"/>
             <w:r>
               <w:rPr>
                 <w:sz w:val="12"/>
                 <w:szCs w:val="12"/>
               </w:rPr>
-              <w:t>PhotoBlogServer[Dir]</w:t>
+              <w:t>PhotoBlogServer</w:t>
+            </w:r>
+            <w:proofErr w:type="spellEnd"/>
+            <w:r>
+              <w:rPr>
+                <w:sz w:val="12"/>
+                <w:szCs w:val="12"/>
+              </w:rPr>
+              <w:t>[</w:t>
+            </w:r>
+            <w:proofErr w:type="gramEnd"/>
+            <w:r>
+              <w:rPr>
+                <w:sz w:val="12"/>
+                <w:szCs w:val="12"/>
+              </w:rPr>
+              <w:t>Dir]</w:t>
             </w:r>
           </w:p>
           <w:p>
@@ -794,12 +1015,30 @@
               </w:rPr>
               <w:t xml:space="preserve">- </w:t>
             </w:r>
+            <w:proofErr w:type="spellStart"/>
+            <w:proofErr w:type="gramStart"/>
             <w:r>
               <w:rPr>
                 <w:sz w:val="12"/>
                 <w:szCs w:val="12"/>
               </w:rPr>
-              <w:t xml:space="preserve">PhotoViewer[Dir] </w:t>
+              <w:t>PhotoViewer</w:t>
+            </w:r>
+            <w:proofErr w:type="spellEnd"/>
+            <w:r>
+              <w:rPr>
+                <w:sz w:val="12"/>
+                <w:szCs w:val="12"/>
+              </w:rPr>
+              <w:t>[</w:t>
+            </w:r>
+            <w:proofErr w:type="gramEnd"/>
+            <w:r>
+              <w:rPr>
+                <w:sz w:val="12"/>
+                <w:szCs w:val="12"/>
+              </w:rPr>
+              <w:t xml:space="preserve">Dir] </w:t>
             </w:r>
           </w:p>
           <w:p>
@@ -865,6 +1104,7 @@
                 <w:szCs w:val="12"/>
               </w:rPr>
             </w:pPr>
+            <w:proofErr w:type="gramStart"/>
             <w:r>
               <w:rPr>
                 <w:rFonts w:cs="Times New Roman" w:hint="eastAsia"/>
@@ -873,7 +1113,18 @@
                 <w:sz w:val="12"/>
                 <w:szCs w:val="12"/>
               </w:rPr>
-              <w:t>제출 : 탐색기</w:t>
+              <w:t>제출 :</w:t>
+            </w:r>
+            <w:proofErr w:type="gramEnd"/>
+            <w:r>
+              <w:rPr>
+                <w:rFonts w:cs="Times New Roman" w:hint="eastAsia"/>
+                <w:color w:val="auto"/>
+                <w:kern w:val="2"/>
+                <w:sz w:val="12"/>
+                <w:szCs w:val="12"/>
+              </w:rPr>
+              <w:t xml:space="preserve"> 탐색기</w:t>
             </w:r>
             <w:r>
               <w:rPr>
@@ -963,6 +1214,21 @@
                 <w:szCs w:val="12"/>
               </w:rPr>
             </w:pPr>
+            <w:r>
+              <w:rPr>
+                <w:rFonts w:cs="Times New Roman"/>
+                <w:noProof/>
+                <w:color w:val="auto"/>
+                <w:kern w:val="2"/>
+                <w:sz w:val="12"/>
+                <w:szCs w:val="12"/>
+              </w:rPr>
+              <w:pict w14:anchorId="2AAB56C5">
+                <v:shape id="그림 1" o:spid="_x0000_i1026" type="#_x0000_t75" style="width:106.1pt;height:30.3pt;visibility:visible;mso-wrap-style:square">
+                  <v:imagedata r:id="rId8" o:title=""/>
+                </v:shape>
+              </w:pict>
+            </w:r>
           </w:p>
         </w:tc>
       </w:tr>
@@ -1006,6 +1272,7 @@
                 <w:szCs w:val="12"/>
               </w:rPr>
             </w:pPr>
+            <w:proofErr w:type="spellStart"/>
             <w:r>
               <w:rPr>
                 <w:rFonts w:hint="eastAsia"/>
@@ -1014,6 +1281,7 @@
               </w:rPr>
               <w:t>제출문</w:t>
             </w:r>
+            <w:proofErr w:type="spellEnd"/>
           </w:p>
         </w:tc>
         <w:tc>
@@ -1028,13 +1296,23 @@
                 <w:szCs w:val="12"/>
               </w:rPr>
             </w:pPr>
+            <w:proofErr w:type="spellStart"/>
             <w:r>
               <w:rPr>
                 <w:sz w:val="12"/>
                 <w:szCs w:val="12"/>
               </w:rPr>
-              <w:t xml:space="preserve">Github </w:t>
+              <w:t>Github</w:t>
             </w:r>
+            <w:proofErr w:type="spellEnd"/>
+            <w:r>
+              <w:rPr>
+                <w:sz w:val="12"/>
+                <w:szCs w:val="12"/>
+              </w:rPr>
+              <w:t xml:space="preserve"> </w:t>
+            </w:r>
+            <w:proofErr w:type="spellStart"/>
             <w:r>
               <w:rPr>
                 <w:rFonts w:hint="eastAsia"/>
@@ -1049,7 +1327,16 @@
                 <w:sz w:val="12"/>
                 <w:szCs w:val="12"/>
               </w:rPr>
-              <w:t xml:space="preserve">파지토리 </w:t>
+              <w:t>파지토리</w:t>
+            </w:r>
+            <w:proofErr w:type="spellEnd"/>
+            <w:r>
+              <w:rPr>
+                <w:rFonts w:hint="eastAsia"/>
+                <w:sz w:val="12"/>
+                <w:szCs w:val="12"/>
+              </w:rPr>
+              <w:t xml:space="preserve"> </w:t>
             </w:r>
             <w:r>
               <w:rPr>
@@ -1076,7 +1363,39 @@
                 <w:sz w:val="12"/>
                 <w:szCs w:val="12"/>
               </w:rPr>
-              <w:t>아래 평가 항목에 대하여 구현 혹은 테스트를 완료하고, 캡처 이미지를 제공된 MS-Word 파일로 정리하여 Github URL을 제출 한다.</w:t>
+              <w:t xml:space="preserve">아래 평가 항목에 대하여 구현 혹은 테스트를 완료하고, 캡처 이미지를 제공된 MS-Word 파일로 정리하여 </w:t>
+            </w:r>
+            <w:proofErr w:type="spellStart"/>
+            <w:r>
+              <w:rPr>
+                <w:sz w:val="12"/>
+                <w:szCs w:val="12"/>
+              </w:rPr>
+              <w:t>Github</w:t>
+            </w:r>
+            <w:proofErr w:type="spellEnd"/>
+            <w:r>
+              <w:rPr>
+                <w:sz w:val="12"/>
+                <w:szCs w:val="12"/>
+              </w:rPr>
+              <w:t xml:space="preserve"> URL을 </w:t>
+            </w:r>
+            <w:proofErr w:type="gramStart"/>
+            <w:r>
+              <w:rPr>
+                <w:sz w:val="12"/>
+                <w:szCs w:val="12"/>
+              </w:rPr>
+              <w:t>제출 한다</w:t>
+            </w:r>
+            <w:proofErr w:type="gramEnd"/>
+            <w:r>
+              <w:rPr>
+                <w:sz w:val="12"/>
+                <w:szCs w:val="12"/>
+              </w:rPr>
+              <w:t>.</w:t>
             </w:r>
           </w:p>
           <w:p>
@@ -1094,6 +1413,7 @@
                 <w:szCs w:val="12"/>
               </w:rPr>
             </w:pPr>
+            <w:proofErr w:type="gramStart"/>
             <w:r>
               <w:rPr>
                 <w:rFonts w:cs="Times New Roman" w:hint="eastAsia"/>
@@ -1102,7 +1422,18 @@
                 <w:sz w:val="12"/>
                 <w:szCs w:val="12"/>
               </w:rPr>
-              <w:t xml:space="preserve">제출 : </w:t>
+              <w:t>제출 :</w:t>
+            </w:r>
+            <w:proofErr w:type="gramEnd"/>
+            <w:r>
+              <w:rPr>
+                <w:rFonts w:cs="Times New Roman" w:hint="eastAsia"/>
+                <w:color w:val="auto"/>
+                <w:kern w:val="2"/>
+                <w:sz w:val="12"/>
+                <w:szCs w:val="12"/>
+              </w:rPr>
+              <w:t xml:space="preserve"> </w:t>
             </w:r>
             <w:r>
               <w:rPr>
@@ -1162,6 +1493,16 @@
                 <w:szCs w:val="12"/>
               </w:rPr>
             </w:pPr>
+            <w:r>
+              <w:rPr>
+                <w:rFonts w:cs="Times New Roman"/>
+                <w:color w:val="auto"/>
+                <w:kern w:val="2"/>
+                <w:sz w:val="12"/>
+                <w:szCs w:val="12"/>
+              </w:rPr>
+              <w:t>https://github.com/park1210/Common_Evaluation_01</w:t>
+            </w:r>
           </w:p>
         </w:tc>
       </w:tr>
@@ -1362,6 +1703,7 @@
                 <w:szCs w:val="12"/>
               </w:rPr>
             </w:pPr>
+            <w:proofErr w:type="gramStart"/>
             <w:r>
               <w:rPr>
                 <w:rFonts w:cs="Times New Roman" w:hint="eastAsia"/>
@@ -1370,7 +1712,18 @@
                 <w:sz w:val="12"/>
                 <w:szCs w:val="12"/>
               </w:rPr>
-              <w:t>제출 : 1.</w:t>
+              <w:t>제출 :</w:t>
+            </w:r>
+            <w:proofErr w:type="gramEnd"/>
+            <w:r>
+              <w:rPr>
+                <w:rFonts w:cs="Times New Roman" w:hint="eastAsia"/>
+                <w:color w:val="auto"/>
+                <w:kern w:val="2"/>
+                <w:sz w:val="12"/>
+                <w:szCs w:val="12"/>
+              </w:rPr>
+              <w:t xml:space="preserve"> 1.</w:t>
             </w:r>
             <w:r>
               <w:rPr>
@@ -1379,7 +1732,6 @@
                 <w:kern w:val="2"/>
                 <w:sz w:val="12"/>
                 <w:szCs w:val="12"/>
-                <w:lang/>
               </w:rPr>
               <w:t xml:space="preserve"> </w:t>
             </w:r>
@@ -1502,12 +1854,54 @@
             <w:pPr>
               <w:rPr>
                 <w:rFonts w:cs="Times New Roman"/>
+                <w:noProof/>
                 <w:color w:val="auto"/>
                 <w:kern w:val="2"/>
                 <w:sz w:val="12"/>
                 <w:szCs w:val="12"/>
               </w:rPr>
             </w:pPr>
+            <w:r>
+              <w:rPr>
+                <w:rFonts w:cs="Times New Roman"/>
+                <w:noProof/>
+                <w:color w:val="auto"/>
+                <w:kern w:val="2"/>
+                <w:sz w:val="12"/>
+                <w:szCs w:val="12"/>
+              </w:rPr>
+              <w:pict w14:anchorId="08AE8DA7">
+                <v:shape id="_x0000_i1027" type="#_x0000_t75" style="width:106.1pt;height:64.4pt;visibility:visible;mso-wrap-style:square">
+                  <v:imagedata r:id="rId9" o:title=""/>
+                </v:shape>
+              </w:pict>
+            </w:r>
+          </w:p>
+          <w:p>
+            <w:pPr>
+              <w:rPr>
+                <w:rFonts w:cs="Times New Roman"/>
+                <w:color w:val="auto"/>
+                <w:kern w:val="2"/>
+                <w:sz w:val="12"/>
+                <w:szCs w:val="12"/>
+              </w:rPr>
+            </w:pPr>
+            <w:r>
+              <w:rPr>
+                <w:rFonts w:cs="Times New Roman"/>
+                <w:noProof/>
+                <w:color w:val="auto"/>
+                <w:kern w:val="2"/>
+                <w:sz w:val="12"/>
+                <w:szCs w:val="12"/>
+              </w:rPr>
+              <w:pict w14:anchorId="34A77037">
+                <v:shape id="_x0000_i1028" type="#_x0000_t75" style="width:106.1pt;height:45.45pt;visibility:visible;mso-wrap-style:square">
+                  <v:imagedata r:id="rId10" o:title=""/>
+                </v:shape>
+              </w:pict>
+            </w:r>
           </w:p>
         </w:tc>
       </w:tr>
@@ -1658,6 +2052,7 @@
                 <w:szCs w:val="12"/>
               </w:rPr>
             </w:pPr>
+            <w:proofErr w:type="gramStart"/>
             <w:r>
               <w:rPr>
                 <w:rFonts w:cs="Times New Roman" w:hint="eastAsia"/>
@@ -1666,7 +2061,18 @@
                 <w:sz w:val="12"/>
                 <w:szCs w:val="12"/>
               </w:rPr>
-              <w:t>제출 : 터미널 화면 캡처</w:t>
+              <w:t>제출 :</w:t>
+            </w:r>
+            <w:proofErr w:type="gramEnd"/>
+            <w:r>
+              <w:rPr>
+                <w:rFonts w:cs="Times New Roman" w:hint="eastAsia"/>
+                <w:color w:val="auto"/>
+                <w:kern w:val="2"/>
+                <w:sz w:val="12"/>
+                <w:szCs w:val="12"/>
+              </w:rPr>
+              <w:t xml:space="preserve"> 터미널 화면 캡처</w:t>
             </w:r>
           </w:p>
         </w:tc>
@@ -1715,6 +2121,21 @@
                 <w:szCs w:val="12"/>
               </w:rPr>
             </w:pPr>
+            <w:r>
+              <w:rPr>
+                <w:rFonts w:cs="Times New Roman"/>
+                <w:noProof/>
+                <w:color w:val="auto"/>
+                <w:kern w:val="2"/>
+                <w:sz w:val="12"/>
+                <w:szCs w:val="12"/>
+              </w:rPr>
+              <w:pict w14:anchorId="0FC2BE79">
+                <v:shape id="_x0000_i1029" type="#_x0000_t75" style="width:106.1pt;height:26.55pt;visibility:visible;mso-wrap-style:square">
+                  <v:imagedata r:id="rId11" o:title=""/>
+                </v:shape>
+              </w:pict>
+            </w:r>
           </w:p>
         </w:tc>
       </w:tr>
@@ -1865,15 +2286,25 @@
                 <w:szCs w:val="12"/>
               </w:rPr>
             </w:pPr>
+            <w:proofErr w:type="gramStart"/>
             <w:r>
               <w:rPr>
                 <w:rFonts w:hint="eastAsia"/>
                 <w:sz w:val="12"/>
                 <w:szCs w:val="12"/>
               </w:rPr>
-              <w:t xml:space="preserve">제출 : </w:t>
+              <w:t>제출 :</w:t>
             </w:r>
-            <w:hyperlink r:id="rId8" w:history="1">
+            <w:proofErr w:type="gramEnd"/>
+            <w:r>
+              <w:rPr>
+                <w:rFonts w:hint="eastAsia"/>
+                <w:sz w:val="12"/>
+                <w:szCs w:val="12"/>
+              </w:rPr>
+              <w:t xml:space="preserve"> </w:t>
+            </w:r>
+            <w:hyperlink r:id="rId12" w:history="1">
               <w:r>
                 <w:rPr>
                   <w:rStyle w:val="affff8"/>
@@ -1939,6 +2370,21 @@
                 <w:szCs w:val="12"/>
               </w:rPr>
             </w:pPr>
+            <w:r>
+              <w:rPr>
+                <w:rFonts w:cs="Times New Roman"/>
+                <w:noProof/>
+                <w:color w:val="auto"/>
+                <w:kern w:val="2"/>
+                <w:sz w:val="12"/>
+                <w:szCs w:val="12"/>
+              </w:rPr>
+              <w:pict w14:anchorId="5481F081">
+                <v:shape id="_x0000_i1030" type="#_x0000_t75" style="width:106.1pt;height:45.45pt;visibility:visible;mso-wrap-style:square">
+                  <v:imagedata r:id="rId13" o:title=""/>
+                </v:shape>
+              </w:pict>
+            </w:r>
           </w:p>
         </w:tc>
       </w:tr>
@@ -2104,6 +2550,7 @@
                 <w:szCs w:val="12"/>
               </w:rPr>
             </w:pPr>
+            <w:proofErr w:type="gramStart"/>
             <w:r>
               <w:rPr>
                 <w:rFonts w:cs="Times New Roman" w:hint="eastAsia"/>
@@ -2114,6 +2561,7 @@
               </w:rPr>
               <w:t>제출 :</w:t>
             </w:r>
+            <w:proofErr w:type="gramEnd"/>
             <w:r>
               <w:rPr>
                 <w:sz w:val="12"/>
@@ -2206,6 +2654,21 @@
                 <w:szCs w:val="12"/>
               </w:rPr>
             </w:pPr>
+            <w:r>
+              <w:rPr>
+                <w:rFonts w:cs="Times New Roman"/>
+                <w:noProof/>
+                <w:color w:val="auto"/>
+                <w:kern w:val="2"/>
+                <w:sz w:val="12"/>
+                <w:szCs w:val="12"/>
+              </w:rPr>
+              <w:pict w14:anchorId="3EC5F922">
+                <v:shape id="_x0000_i1031" type="#_x0000_t75" style="width:106.1pt;height:41.7pt;visibility:visible;mso-wrap-style:square">
+                  <v:imagedata r:id="rId14" o:title=""/>
+                </v:shape>
+              </w:pict>
+            </w:r>
           </w:p>
         </w:tc>
       </w:tr>
@@ -2232,6 +2695,7 @@
                 <w:sz w:val="12"/>
                 <w:szCs w:val="12"/>
               </w:rPr>
+              <w:lastRenderedPageBreak/>
               <w:t>7</w:t>
             </w:r>
           </w:p>
@@ -2296,12 +2760,21 @@
               </w:rPr>
               <w:t>Server/Client 연동 테스트 [</w:t>
             </w:r>
+            <w:proofErr w:type="spellStart"/>
             <w:r>
               <w:rPr>
                 <w:sz w:val="12"/>
                 <w:szCs w:val="12"/>
               </w:rPr>
-              <w:t xml:space="preserve">Sockec </w:t>
+              <w:t>Sockec</w:t>
+            </w:r>
+            <w:proofErr w:type="spellEnd"/>
+            <w:r>
+              <w:rPr>
+                <w:sz w:val="12"/>
+                <w:szCs w:val="12"/>
+              </w:rPr>
+              <w:t xml:space="preserve"> </w:t>
             </w:r>
             <w:r>
               <w:rPr>
@@ -2371,6 +2844,7 @@
                 <w:szCs w:val="12"/>
               </w:rPr>
             </w:pPr>
+            <w:proofErr w:type="gramStart"/>
             <w:r>
               <w:rPr>
                 <w:rFonts w:cs="Times New Roman" w:hint="eastAsia"/>
@@ -2379,7 +2853,18 @@
                 <w:sz w:val="12"/>
                 <w:szCs w:val="12"/>
               </w:rPr>
-              <w:t xml:space="preserve">제출 : 수신 파일 </w:t>
+              <w:t>제출 :</w:t>
+            </w:r>
+            <w:proofErr w:type="gramEnd"/>
+            <w:r>
+              <w:rPr>
+                <w:rFonts w:cs="Times New Roman" w:hint="eastAsia"/>
+                <w:color w:val="auto"/>
+                <w:kern w:val="2"/>
+                <w:sz w:val="12"/>
+                <w:szCs w:val="12"/>
+              </w:rPr>
+              <w:t xml:space="preserve"> 수신 파일 </w:t>
             </w:r>
             <w:r>
               <w:rPr>
@@ -2399,8 +2884,20 @@
                 <w:sz w:val="12"/>
                 <w:szCs w:val="12"/>
               </w:rPr>
-              <w:t xml:space="preserve"> 편집화면캡처</w:t>
+              <w:t xml:space="preserve"> </w:t>
             </w:r>
+            <w:proofErr w:type="spellStart"/>
+            <w:r>
+              <w:rPr>
+                <w:rFonts w:cs="Times New Roman" w:hint="eastAsia"/>
+                <w:color w:val="auto"/>
+                <w:kern w:val="2"/>
+                <w:sz w:val="12"/>
+                <w:szCs w:val="12"/>
+              </w:rPr>
+              <w:t>편집화면캡처</w:t>
+            </w:r>
+            <w:proofErr w:type="spellEnd"/>
           </w:p>
         </w:tc>
         <w:tc>
@@ -2448,6 +2945,21 @@
                 <w:szCs w:val="12"/>
               </w:rPr>
             </w:pPr>
+            <w:r>
+              <w:rPr>
+                <w:rFonts w:cs="Times New Roman"/>
+                <w:noProof/>
+                <w:color w:val="auto"/>
+                <w:kern w:val="2"/>
+                <w:sz w:val="12"/>
+                <w:szCs w:val="12"/>
+              </w:rPr>
+              <w:pict w14:anchorId="4123EEAA">
+                <v:shape id="_x0000_i1032" type="#_x0000_t75" style="width:106.1pt;height:22.75pt;visibility:visible;mso-wrap-style:square">
+                  <v:imagedata r:id="rId15" o:title=""/>
+                </v:shape>
+              </w:pict>
+            </w:r>
           </w:p>
         </w:tc>
       </w:tr>
@@ -2582,13 +3094,23 @@
                 <w:szCs w:val="12"/>
               </w:rPr>
             </w:pPr>
+            <w:proofErr w:type="gramStart"/>
             <w:r>
               <w:rPr>
                 <w:rFonts w:hint="eastAsia"/>
                 <w:sz w:val="12"/>
                 <w:szCs w:val="12"/>
               </w:rPr>
-              <w:t xml:space="preserve">제출 : </w:t>
+              <w:t>제출 :</w:t>
+            </w:r>
+            <w:proofErr w:type="gramEnd"/>
+            <w:r>
+              <w:rPr>
+                <w:rFonts w:hint="eastAsia"/>
+                <w:sz w:val="12"/>
+                <w:szCs w:val="12"/>
+              </w:rPr>
+              <w:t xml:space="preserve"> </w:t>
             </w:r>
             <w:r>
               <w:rPr>
@@ -2668,6 +3190,21 @@
                 <w:szCs w:val="12"/>
               </w:rPr>
             </w:pPr>
+            <w:r>
+              <w:rPr>
+                <w:rFonts w:cs="Times New Roman"/>
+                <w:noProof/>
+                <w:color w:val="auto"/>
+                <w:kern w:val="2"/>
+                <w:sz w:val="12"/>
+                <w:szCs w:val="12"/>
+              </w:rPr>
+              <w:pict w14:anchorId="4C36E2DE">
+                <v:shape id="_x0000_i1033" type="#_x0000_t75" style="width:106.1pt;height:60.65pt;visibility:visible;mso-wrap-style:square">
+                  <v:imagedata r:id="rId16" o:title=""/>
+                </v:shape>
+              </w:pict>
+            </w:r>
           </w:p>
         </w:tc>
       </w:tr>
@@ -2802,13 +3339,23 @@
                 <w:szCs w:val="12"/>
               </w:rPr>
             </w:pPr>
+            <w:proofErr w:type="gramStart"/>
             <w:r>
               <w:rPr>
                 <w:rFonts w:hint="eastAsia"/>
                 <w:sz w:val="12"/>
                 <w:szCs w:val="12"/>
               </w:rPr>
-              <w:t xml:space="preserve">제출 : </w:t>
+              <w:t>제출 :</w:t>
+            </w:r>
+            <w:proofErr w:type="gramEnd"/>
+            <w:r>
+              <w:rPr>
+                <w:rFonts w:hint="eastAsia"/>
+                <w:sz w:val="12"/>
+                <w:szCs w:val="12"/>
+              </w:rPr>
+              <w:t xml:space="preserve"> </w:t>
             </w:r>
             <w:r>
               <w:rPr>
@@ -2865,6 +3412,21 @@
                 <w:szCs w:val="12"/>
               </w:rPr>
             </w:pPr>
+            <w:r>
+              <w:rPr>
+                <w:rFonts w:cs="Times New Roman"/>
+                <w:noProof/>
+                <w:color w:val="auto"/>
+                <w:kern w:val="2"/>
+                <w:sz w:val="12"/>
+                <w:szCs w:val="12"/>
+              </w:rPr>
+              <w:pict w14:anchorId="6BDAE8AE">
+                <v:shape id="_x0000_i1034" type="#_x0000_t75" style="width:106.1pt;height:231.15pt;visibility:visible;mso-wrap-style:square">
+                  <v:imagedata r:id="rId17" o:title=""/>
+                </v:shape>
+              </w:pict>
+            </w:r>
           </w:p>
         </w:tc>
       </w:tr>
@@ -2999,13 +3561,23 @@
                 <w:szCs w:val="12"/>
               </w:rPr>
             </w:pPr>
+            <w:proofErr w:type="gramStart"/>
             <w:r>
               <w:rPr>
                 <w:rFonts w:hint="eastAsia"/>
                 <w:sz w:val="12"/>
                 <w:szCs w:val="12"/>
               </w:rPr>
-              <w:t xml:space="preserve">제출 : </w:t>
+              <w:t>제출 :</w:t>
+            </w:r>
+            <w:proofErr w:type="gramEnd"/>
+            <w:r>
+              <w:rPr>
+                <w:rFonts w:hint="eastAsia"/>
+                <w:sz w:val="12"/>
+                <w:szCs w:val="12"/>
+              </w:rPr>
+              <w:t xml:space="preserve"> </w:t>
             </w:r>
             <w:r>
               <w:rPr>
@@ -3085,6 +3657,21 @@
                 <w:szCs w:val="12"/>
               </w:rPr>
             </w:pPr>
+            <w:r>
+              <w:rPr>
+                <w:rFonts w:cs="Times New Roman"/>
+                <w:noProof/>
+                <w:color w:val="auto"/>
+                <w:kern w:val="2"/>
+                <w:sz w:val="12"/>
+                <w:szCs w:val="12"/>
+              </w:rPr>
+              <w:pict w14:anchorId="052FA803">
+                <v:shape id="_x0000_i1035" type="#_x0000_t75" style="width:106.1pt;height:231.15pt;visibility:visible;mso-wrap-style:square">
+                  <v:imagedata r:id="rId18" o:title=""/>
+                </v:shape>
+              </w:pict>
+            </w:r>
           </w:p>
         </w:tc>
       </w:tr>
@@ -3112,7 +3699,6 @@
                 <w:sz w:val="12"/>
                 <w:szCs w:val="12"/>
               </w:rPr>
-              <w:lastRenderedPageBreak/>
               <w:t>11</w:t>
             </w:r>
           </w:p>
@@ -3171,13 +3757,23 @@
                 <w:szCs w:val="12"/>
               </w:rPr>
             </w:pPr>
+            <w:proofErr w:type="spellStart"/>
             <w:r>
               <w:rPr>
                 <w:rFonts w:hint="eastAsia"/>
                 <w:sz w:val="12"/>
                 <w:szCs w:val="12"/>
               </w:rPr>
-              <w:t>MainActivity 클래스 [Upload 구현, 19page]</w:t>
+              <w:t>MainActivity</w:t>
+            </w:r>
+            <w:proofErr w:type="spellEnd"/>
+            <w:r>
+              <w:rPr>
+                <w:rFonts w:hint="eastAsia"/>
+                <w:sz w:val="12"/>
+                <w:szCs w:val="12"/>
+              </w:rPr>
+              <w:t xml:space="preserve"> 클래스 [Upload 구현, 19page]</w:t>
             </w:r>
           </w:p>
         </w:tc>
@@ -3200,12 +3796,21 @@
               </w:rPr>
               <w:t xml:space="preserve">강의 자료(1) </w:t>
             </w:r>
+            <w:proofErr w:type="spellStart"/>
             <w:r>
               <w:rPr>
                 <w:sz w:val="12"/>
                 <w:szCs w:val="12"/>
               </w:rPr>
-              <w:t>MainActivity 클래스 [Upload 구현, 19page]</w:t>
+              <w:t>MainActivity</w:t>
+            </w:r>
+            <w:proofErr w:type="spellEnd"/>
+            <w:r>
+              <w:rPr>
+                <w:sz w:val="12"/>
+                <w:szCs w:val="12"/>
+              </w:rPr>
+              <w:t xml:space="preserve"> 클래스 [Upload 구현, 19page]</w:t>
             </w:r>
           </w:p>
           <w:p>
@@ -3237,7 +3842,23 @@
                 <w:sz w:val="12"/>
                 <w:szCs w:val="12"/>
               </w:rPr>
-              <w:t>Upload (Hard cording) : 중</w:t>
+              <w:t>Upload (Hard cording</w:t>
+            </w:r>
+            <w:proofErr w:type="gramStart"/>
+            <w:r>
+              <w:rPr>
+                <w:sz w:val="12"/>
+                <w:szCs w:val="12"/>
+              </w:rPr>
+              <w:t>) :</w:t>
+            </w:r>
+            <w:proofErr w:type="gramEnd"/>
+            <w:r>
+              <w:rPr>
+                <w:sz w:val="12"/>
+                <w:szCs w:val="12"/>
+              </w:rPr>
+              <w:t xml:space="preserve"> 중</w:t>
             </w:r>
           </w:p>
           <w:p>
@@ -3383,12 +4004,21 @@
                 <w:szCs w:val="12"/>
               </w:rPr>
             </w:pPr>
+            <w:proofErr w:type="spellStart"/>
             <w:r>
               <w:rPr>
                 <w:sz w:val="12"/>
                 <w:szCs w:val="12"/>
               </w:rPr>
-              <w:t>MainActivity 클래스 [Upload 구현, 19page]</w:t>
+              <w:t>MainActivity</w:t>
+            </w:r>
+            <w:proofErr w:type="spellEnd"/>
+            <w:r>
+              <w:rPr>
+                <w:sz w:val="12"/>
+                <w:szCs w:val="12"/>
+              </w:rPr>
+              <w:t xml:space="preserve"> 클래스 [Upload 구현, 19page]</w:t>
             </w:r>
           </w:p>
           <w:p>
@@ -3420,7 +4050,23 @@
                 <w:sz w:val="12"/>
                 <w:szCs w:val="12"/>
               </w:rPr>
-              <w:t>Upload (Post에 따른 UI제공) : 상</w:t>
+              <w:t>Upload (Post에 따른 UI제공</w:t>
+            </w:r>
+            <w:proofErr w:type="gramStart"/>
+            <w:r>
+              <w:rPr>
+                <w:sz w:val="12"/>
+                <w:szCs w:val="12"/>
+              </w:rPr>
+              <w:t>) :</w:t>
+            </w:r>
+            <w:proofErr w:type="gramEnd"/>
+            <w:r>
+              <w:rPr>
+                <w:sz w:val="12"/>
+                <w:szCs w:val="12"/>
+              </w:rPr>
+              <w:t xml:space="preserve"> 상</w:t>
             </w:r>
           </w:p>
           <w:p>
@@ -3495,12 +4141,66 @@
             <w:pPr>
               <w:rPr>
                 <w:rFonts w:cs="Times New Roman"/>
+                <w:noProof/>
                 <w:color w:val="auto"/>
                 <w:kern w:val="2"/>
                 <w:sz w:val="12"/>
                 <w:szCs w:val="12"/>
               </w:rPr>
             </w:pPr>
+            <w:r>
+              <w:rPr>
+                <w:rFonts w:cs="Times New Roman"/>
+                <w:noProof/>
+                <w:color w:val="auto"/>
+                <w:kern w:val="2"/>
+                <w:sz w:val="12"/>
+                <w:szCs w:val="12"/>
+              </w:rPr>
+              <w:pict w14:anchorId="31A6C6E9">
+                <v:shape id="_x0000_i1036" type="#_x0000_t75" style="width:106.1pt;height:227.35pt;visibility:visible;mso-wrap-style:square">
+                  <v:imagedata r:id="rId19" o:title=""/>
+                </v:shape>
+              </w:pict>
+            </w:r>
+          </w:p>
+          <w:p>
+            <w:pPr>
+              <w:rPr>
+                <w:rFonts w:cs="Times New Roman"/>
+                <w:noProof/>
+                <w:color w:val="auto"/>
+                <w:kern w:val="2"/>
+                <w:sz w:val="12"/>
+                <w:szCs w:val="12"/>
+              </w:rPr>
+            </w:pPr>
+          </w:p>
+          <w:p>
+            <w:pPr>
+              <w:rPr>
+                <w:rFonts w:cs="Times New Roman"/>
+                <w:color w:val="auto"/>
+                <w:kern w:val="2"/>
+                <w:sz w:val="12"/>
+                <w:szCs w:val="12"/>
+              </w:rPr>
+            </w:pPr>
+            <w:r>
+              <w:rPr>
+                <w:rFonts w:cs="Times New Roman"/>
+                <w:noProof/>
+                <w:color w:val="auto"/>
+                <w:kern w:val="2"/>
+                <w:sz w:val="12"/>
+                <w:szCs w:val="12"/>
+              </w:rPr>
+              <w:pict w14:anchorId="7E2E37FF">
+                <v:shape id="_x0000_i1037" type="#_x0000_t75" style="width:106.1pt;height:231.15pt;visibility:visible;mso-wrap-style:square">
+                  <v:imagedata r:id="rId20" o:title=""/>
+                </v:shape>
+              </w:pict>
+            </w:r>
           </w:p>
         </w:tc>
       </w:tr>
@@ -3558,13 +4258,23 @@
                 <w:szCs w:val="12"/>
               </w:rPr>
             </w:pPr>
+            <w:proofErr w:type="spellStart"/>
             <w:r>
               <w:rPr>
                 <w:rFonts w:hint="eastAsia"/>
                 <w:sz w:val="12"/>
                 <w:szCs w:val="12"/>
               </w:rPr>
-              <w:t>Pythonanywhere 클라우드상 동작</w:t>
+              <w:t>Pythonanywhere</w:t>
+            </w:r>
+            <w:proofErr w:type="spellEnd"/>
+            <w:r>
+              <w:rPr>
+                <w:rFonts w:hint="eastAsia"/>
+                <w:sz w:val="12"/>
+                <w:szCs w:val="12"/>
+              </w:rPr>
+              <w:t xml:space="preserve"> 클라우드상 동작</w:t>
             </w:r>
           </w:p>
         </w:tc>
@@ -3579,13 +4289,23 @@
                 <w:szCs w:val="12"/>
               </w:rPr>
             </w:pPr>
+            <w:proofErr w:type="spellStart"/>
             <w:r>
               <w:rPr>
                 <w:rFonts w:hint="eastAsia"/>
                 <w:sz w:val="12"/>
                 <w:szCs w:val="12"/>
               </w:rPr>
-              <w:t xml:space="preserve">Pythonanywhere 클라우드상 </w:t>
+              <w:t>Pythonanywhere</w:t>
+            </w:r>
+            <w:proofErr w:type="spellEnd"/>
+            <w:r>
+              <w:rPr>
+                <w:rFonts w:hint="eastAsia"/>
+                <w:sz w:val="12"/>
+                <w:szCs w:val="12"/>
+              </w:rPr>
+              <w:t xml:space="preserve"> 클라우드상 </w:t>
             </w:r>
             <w:r>
               <w:rPr>
@@ -3627,13 +4347,23 @@
                 <w:szCs w:val="12"/>
               </w:rPr>
             </w:pPr>
+            <w:proofErr w:type="gramStart"/>
             <w:r>
               <w:rPr>
                 <w:rFonts w:hint="eastAsia"/>
                 <w:sz w:val="12"/>
                 <w:szCs w:val="12"/>
               </w:rPr>
-              <w:t xml:space="preserve">제출 : </w:t>
+              <w:t>제출 :</w:t>
+            </w:r>
+            <w:proofErr w:type="gramEnd"/>
+            <w:r>
+              <w:rPr>
+                <w:rFonts w:hint="eastAsia"/>
+                <w:sz w:val="12"/>
+                <w:szCs w:val="12"/>
+              </w:rPr>
+              <w:t xml:space="preserve"> </w:t>
             </w:r>
             <w:r>
               <w:rPr>
@@ -3698,6 +4428,21 @@
                 <w:szCs w:val="12"/>
               </w:rPr>
             </w:pPr>
+            <w:r>
+              <w:rPr>
+                <w:rFonts w:cs="Times New Roman"/>
+                <w:noProof/>
+                <w:color w:val="auto"/>
+                <w:kern w:val="2"/>
+                <w:sz w:val="12"/>
+                <w:szCs w:val="12"/>
+              </w:rPr>
+              <w:pict w14:anchorId="376B24EC">
+                <v:shape id="_x0000_i1038" type="#_x0000_t75" style="width:106.1pt;height:64.4pt;visibility:visible;mso-wrap-style:square">
+                  <v:imagedata r:id="rId21" o:title=""/>
+                </v:shape>
+              </w:pict>
+            </w:r>
           </w:p>
         </w:tc>
       </w:tr>
@@ -3724,6 +4469,7 @@
                 <w:sz w:val="12"/>
                 <w:szCs w:val="12"/>
               </w:rPr>
+              <w:lastRenderedPageBreak/>
               <w:t>13</w:t>
             </w:r>
           </w:p>
@@ -3755,13 +4501,23 @@
                 <w:szCs w:val="12"/>
               </w:rPr>
             </w:pPr>
+            <w:proofErr w:type="spellStart"/>
             <w:r>
               <w:rPr>
                 <w:rFonts w:hint="eastAsia"/>
                 <w:sz w:val="12"/>
                 <w:szCs w:val="12"/>
               </w:rPr>
-              <w:t>Pythonanywhere 클라우드상 동작</w:t>
+              <w:t>Pythonanywhere</w:t>
+            </w:r>
+            <w:proofErr w:type="spellEnd"/>
+            <w:r>
+              <w:rPr>
+                <w:rFonts w:hint="eastAsia"/>
+                <w:sz w:val="12"/>
+                <w:szCs w:val="12"/>
+              </w:rPr>
+              <w:t xml:space="preserve"> 클라우드상 동작</w:t>
             </w:r>
           </w:p>
         </w:tc>
@@ -3776,13 +4532,23 @@
                 <w:szCs w:val="12"/>
               </w:rPr>
             </w:pPr>
+            <w:proofErr w:type="spellStart"/>
             <w:r>
               <w:rPr>
                 <w:rFonts w:hint="eastAsia"/>
                 <w:sz w:val="12"/>
                 <w:szCs w:val="12"/>
               </w:rPr>
-              <w:t xml:space="preserve">Pythonanywhere 클라우드상 </w:t>
+              <w:t>Pythonanywhere</w:t>
+            </w:r>
+            <w:proofErr w:type="spellEnd"/>
+            <w:r>
+              <w:rPr>
+                <w:rFonts w:hint="eastAsia"/>
+                <w:sz w:val="12"/>
+                <w:szCs w:val="12"/>
+              </w:rPr>
+              <w:t xml:space="preserve"> 클라우드상 </w:t>
             </w:r>
             <w:r>
               <w:rPr>
@@ -3824,13 +4590,23 @@
                 <w:szCs w:val="12"/>
               </w:rPr>
             </w:pPr>
+            <w:proofErr w:type="gramStart"/>
             <w:r>
               <w:rPr>
                 <w:rFonts w:hint="eastAsia"/>
                 <w:sz w:val="12"/>
                 <w:szCs w:val="12"/>
               </w:rPr>
-              <w:t xml:space="preserve">제출 : </w:t>
+              <w:t>제출 :</w:t>
+            </w:r>
+            <w:proofErr w:type="gramEnd"/>
+            <w:r>
+              <w:rPr>
+                <w:rFonts w:hint="eastAsia"/>
+                <w:sz w:val="12"/>
+                <w:szCs w:val="12"/>
+              </w:rPr>
+              <w:t xml:space="preserve"> </w:t>
             </w:r>
             <w:r>
               <w:rPr>
@@ -3895,6 +4671,21 @@
                 <w:szCs w:val="12"/>
               </w:rPr>
             </w:pPr>
+            <w:r>
+              <w:rPr>
+                <w:rFonts w:cs="Times New Roman"/>
+                <w:noProof/>
+                <w:color w:val="auto"/>
+                <w:kern w:val="2"/>
+                <w:sz w:val="12"/>
+                <w:szCs w:val="12"/>
+              </w:rPr>
+              <w:pict w14:anchorId="7F28E076">
+                <v:shape id="_x0000_i1039" type="#_x0000_t75" style="width:106.1pt;height:227.35pt;visibility:visible;mso-wrap-style:square">
+                  <v:imagedata r:id="rId22" o:title=""/>
+                </v:shape>
+              </w:pict>
+            </w:r>
           </w:p>
         </w:tc>
       </w:tr>
@@ -3958,7 +4749,458 @@
                 <w:sz w:val="12"/>
                 <w:szCs w:val="12"/>
               </w:rPr>
-              <w:t>기타 기획 되지 않은 Client  편의 기능 [최대 5개]</w:t>
+              <w:t xml:space="preserve">기타 </w:t>
+            </w:r>
+            <w:proofErr w:type="gramStart"/>
+            <w:r>
+              <w:rPr>
+                <w:rFonts w:hint="eastAsia"/>
+                <w:sz w:val="12"/>
+                <w:szCs w:val="12"/>
+              </w:rPr>
+              <w:t>기획 되지</w:t>
+            </w:r>
+            <w:proofErr w:type="gramEnd"/>
+            <w:r>
+              <w:rPr>
+                <w:rFonts w:hint="eastAsia"/>
+                <w:sz w:val="12"/>
+                <w:szCs w:val="12"/>
+              </w:rPr>
+              <w:t xml:space="preserve"> 않은 </w:t>
+            </w:r>
+            <w:proofErr w:type="gramStart"/>
+            <w:r>
+              <w:rPr>
+                <w:rFonts w:hint="eastAsia"/>
+                <w:sz w:val="12"/>
+                <w:szCs w:val="12"/>
+              </w:rPr>
+              <w:t>Client  편의</w:t>
+            </w:r>
+            <w:proofErr w:type="gramEnd"/>
+            <w:r>
+              <w:rPr>
+                <w:rFonts w:hint="eastAsia"/>
+                <w:sz w:val="12"/>
+                <w:szCs w:val="12"/>
+              </w:rPr>
+              <w:t xml:space="preserve"> 기능 [최대 5개]</w:t>
+            </w:r>
+          </w:p>
+          <w:p>
+            <w:pPr>
+              <w:jc w:val="left"/>
+              <w:rPr>
+                <w:sz w:val="12"/>
+                <w:szCs w:val="12"/>
+              </w:rPr>
+            </w:pPr>
+          </w:p>
+          <w:p>
+            <w:pPr>
+              <w:jc w:val="left"/>
+              <w:rPr>
+                <w:sz w:val="12"/>
+                <w:szCs w:val="12"/>
+              </w:rPr>
+            </w:pPr>
+            <w:r>
+              <w:rPr>
+                <w:rFonts w:hint="eastAsia"/>
+                <w:sz w:val="12"/>
+                <w:szCs w:val="12"/>
+              </w:rPr>
+              <w:t>1. 게시물 작성 내용 자동 임시저장 및 복원</w:t>
+            </w:r>
+          </w:p>
+        </w:tc>
+        <w:tc>
+          <w:tcPr>
+            <w:tcW w:w="3582" w:type="dxa"/>
+          </w:tcPr>
+          <w:p>
+            <w:pPr>
+              <w:rPr>
+                <w:sz w:val="12"/>
+                <w:szCs w:val="12"/>
+              </w:rPr>
+            </w:pPr>
+            <w:proofErr w:type="gramStart"/>
+            <w:r>
+              <w:rPr>
+                <w:rFonts w:hint="eastAsia"/>
+                <w:sz w:val="12"/>
+                <w:szCs w:val="12"/>
+              </w:rPr>
+              <w:t>제출 :</w:t>
+            </w:r>
+            <w:proofErr w:type="gramEnd"/>
+            <w:r>
+              <w:rPr>
+                <w:rFonts w:hint="eastAsia"/>
+                <w:sz w:val="12"/>
+                <w:szCs w:val="12"/>
+              </w:rPr>
+              <w:t xml:space="preserve"> 해당 기능 정의, 설명 및 동작 증빙 화면 캡처</w:t>
+            </w:r>
+          </w:p>
+          <w:p>
+            <w:pPr>
+              <w:rPr>
+                <w:sz w:val="12"/>
+                <w:szCs w:val="12"/>
+              </w:rPr>
+            </w:pPr>
+            <w:r>
+              <w:rPr>
+                <w:rFonts w:hint="eastAsia"/>
+                <w:sz w:val="12"/>
+                <w:szCs w:val="12"/>
+              </w:rPr>
+              <w:t xml:space="preserve">(서버/클라이언트 각각 구현이 필요한 경우 별도 요구사항으로 </w:t>
+            </w:r>
+            <w:proofErr w:type="gramStart"/>
+            <w:r>
+              <w:rPr>
+                <w:rFonts w:hint="eastAsia"/>
+                <w:sz w:val="12"/>
+                <w:szCs w:val="12"/>
+              </w:rPr>
+              <w:t>등록 함</w:t>
+            </w:r>
+            <w:proofErr w:type="gramEnd"/>
+            <w:r>
+              <w:rPr>
+                <w:rFonts w:hint="eastAsia"/>
+                <w:sz w:val="12"/>
+                <w:szCs w:val="12"/>
+              </w:rPr>
+              <w:t>)</w:t>
+            </w:r>
+          </w:p>
+          <w:p>
+            <w:pPr>
+              <w:rPr>
+                <w:sz w:val="12"/>
+                <w:szCs w:val="12"/>
+              </w:rPr>
+            </w:pPr>
+          </w:p>
+          <w:p>
+            <w:pPr>
+              <w:rPr>
+                <w:sz w:val="12"/>
+                <w:szCs w:val="12"/>
+              </w:rPr>
+            </w:pPr>
+            <w:r>
+              <w:rPr>
+                <w:rFonts w:hint="eastAsia"/>
+                <w:sz w:val="12"/>
+                <w:szCs w:val="12"/>
+              </w:rPr>
+              <w:t>사용자가</w:t>
+            </w:r>
+            <w:r>
+              <w:rPr>
+                <w:sz w:val="12"/>
+                <w:szCs w:val="12"/>
+              </w:rPr>
+              <w:t xml:space="preserve"> 게시물 작성 화면에서 제목, 본문, 이미지를 입력하던 중 </w:t>
+            </w:r>
+            <w:proofErr w:type="spellStart"/>
+            <w:r>
+              <w:rPr>
+                <w:sz w:val="12"/>
+                <w:szCs w:val="12"/>
+              </w:rPr>
+              <w:t>뒤로가기</w:t>
+            </w:r>
+            <w:proofErr w:type="spellEnd"/>
+            <w:r>
+              <w:rPr>
+                <w:sz w:val="12"/>
+                <w:szCs w:val="12"/>
+              </w:rPr>
+              <w:t xml:space="preserve">, 화면 전환, 앱 종료 등의 이유로 작성 화면을 벗어나더라도 기존 입력 내용을 다시 작성하지 않도록 자동 임시저장 기능을 구현하였다. 제목과 본문은 </w:t>
+            </w:r>
+            <w:proofErr w:type="spellStart"/>
+            <w:r>
+              <w:rPr>
+                <w:sz w:val="12"/>
+                <w:szCs w:val="12"/>
+              </w:rPr>
+              <w:t>SharedPreferences</w:t>
+            </w:r>
+            <w:proofErr w:type="spellEnd"/>
+            <w:r>
+              <w:rPr>
+                <w:sz w:val="12"/>
+                <w:szCs w:val="12"/>
+              </w:rPr>
+              <w:t xml:space="preserve">에 자동 저장하고, 선택한 이미지는 URI 정보를 함께 저장하여 재진입 시 이전 작성 상태를 복원할 수 있도록 하였다.  </w:t>
+            </w:r>
+          </w:p>
+          <w:p>
+            <w:pPr>
+              <w:rPr>
+                <w:sz w:val="12"/>
+                <w:szCs w:val="12"/>
+              </w:rPr>
+            </w:pPr>
+            <w:r>
+              <w:rPr>
+                <w:rFonts w:hint="eastAsia"/>
+                <w:sz w:val="12"/>
+                <w:szCs w:val="12"/>
+              </w:rPr>
+              <w:t>사용자가</w:t>
+            </w:r>
+            <w:r>
+              <w:rPr>
+                <w:sz w:val="12"/>
+                <w:szCs w:val="12"/>
+              </w:rPr>
+              <w:t xml:space="preserve"> 작성 화면에 다시 진입하면 기존 임시저장 데이터의 존재 여부를 확인하고, 임시저장 내용이 있을 경우 ‘이어서 작성’과 ‘새로 작성’ 중 하나를 선택할 수 있는 안내 창을 제공한다. ‘이어서 작성’을 선택하면 이전 제목, 본문, 선택 이미지가 복원되며, ‘새로 작성’을 선택하면 기존 임시저장 데이터를 삭제하고 빈 작성 화면으로 시작한다. 게시물이 정상적으로 서버에 </w:t>
+            </w:r>
+            <w:proofErr w:type="spellStart"/>
+            <w:r>
+              <w:rPr>
+                <w:sz w:val="12"/>
+                <w:szCs w:val="12"/>
+              </w:rPr>
+              <w:t>업로드된</w:t>
+            </w:r>
+            <w:proofErr w:type="spellEnd"/>
+            <w:r>
+              <w:rPr>
+                <w:sz w:val="12"/>
+                <w:szCs w:val="12"/>
+              </w:rPr>
+              <w:t xml:space="preserve"> 경우에는 임시저장 데이터를 자동으로 삭제하여 이미 게시된 내용이 다시 복원되</w:t>
+            </w:r>
+            <w:r>
+              <w:rPr>
+                <w:rFonts w:hint="eastAsia"/>
+                <w:sz w:val="12"/>
+                <w:szCs w:val="12"/>
+              </w:rPr>
+              <w:t>지</w:t>
+            </w:r>
+            <w:r>
+              <w:rPr>
+                <w:sz w:val="12"/>
+                <w:szCs w:val="12"/>
+              </w:rPr>
+              <w:t xml:space="preserve"> 않도록 처리하였다.  </w:t>
+            </w:r>
+          </w:p>
+          <w:p>
+            <w:pPr>
+              <w:rPr>
+                <w:sz w:val="12"/>
+                <w:szCs w:val="12"/>
+              </w:rPr>
+            </w:pPr>
+            <w:r>
+              <w:rPr>
+                <w:rFonts w:hint="eastAsia"/>
+                <w:sz w:val="12"/>
+                <w:szCs w:val="12"/>
+              </w:rPr>
+              <w:t>편의성</w:t>
+            </w:r>
+            <w:r>
+              <w:rPr>
+                <w:sz w:val="12"/>
+                <w:szCs w:val="12"/>
+              </w:rPr>
+              <w:t xml:space="preserve"> 개선 효과: 사용자가 실수로 화면을 벗어나거나 앱이 종료된 경우 발생하는 입력 내용 손실과 재입력 부담을 줄이고, 사용자가 중단한 작업을 자연스럽게 이어서 수행할 수 있도록 하여 작업 연속성을 높였다.</w:t>
+            </w:r>
+          </w:p>
+        </w:tc>
+        <w:tc>
+          <w:tcPr>
+            <w:tcW w:w="484" w:type="dxa"/>
+            <w:vAlign w:val="center"/>
+          </w:tcPr>
+          <w:p>
+            <w:pPr>
+              <w:jc w:val="center"/>
+              <w:rPr>
+                <w:sz w:val="12"/>
+                <w:szCs w:val="12"/>
+              </w:rPr>
+            </w:pPr>
+          </w:p>
+        </w:tc>
+        <w:tc>
+          <w:tcPr>
+            <w:tcW w:w="426" w:type="dxa"/>
+            <w:vAlign w:val="center"/>
+          </w:tcPr>
+          <w:p>
+            <w:pPr>
+              <w:jc w:val="center"/>
+              <w:rPr>
+                <w:sz w:val="12"/>
+                <w:szCs w:val="12"/>
+              </w:rPr>
+            </w:pPr>
+          </w:p>
+        </w:tc>
+        <w:tc>
+          <w:tcPr>
+            <w:tcW w:w="2173" w:type="dxa"/>
+            <w:vAlign w:val="center"/>
+          </w:tcPr>
+          <w:p>
+            <w:pPr>
+              <w:rPr>
+                <w:rFonts w:cs="Times New Roman"/>
+                <w:noProof/>
+                <w:color w:val="auto"/>
+                <w:kern w:val="2"/>
+                <w:sz w:val="12"/>
+                <w:szCs w:val="12"/>
+              </w:rPr>
+            </w:pPr>
+            <w:r>
+              <w:rPr>
+                <w:rFonts w:cs="Times New Roman"/>
+                <w:noProof/>
+                <w:color w:val="auto"/>
+                <w:kern w:val="2"/>
+                <w:sz w:val="12"/>
+                <w:szCs w:val="12"/>
+              </w:rPr>
+              <w:pict w14:anchorId="6ED43FEC">
+                <v:shape id="_x0000_i1040" type="#_x0000_t75" style="width:106.1pt;height:238.75pt;visibility:visible;mso-wrap-style:square">
+                  <v:imagedata r:id="rId23" o:title=""/>
+                </v:shape>
+              </w:pict>
+            </w:r>
+          </w:p>
+          <w:p>
+            <w:pPr>
+              <w:rPr>
+                <w:rFonts w:cs="Times New Roman"/>
+                <w:noProof/>
+                <w:color w:val="auto"/>
+                <w:kern w:val="2"/>
+                <w:sz w:val="12"/>
+                <w:szCs w:val="12"/>
+              </w:rPr>
+            </w:pPr>
+          </w:p>
+          <w:p>
+            <w:pPr>
+              <w:rPr>
+                <w:rFonts w:cs="Times New Roman"/>
+                <w:noProof/>
+                <w:color w:val="auto"/>
+                <w:kern w:val="2"/>
+                <w:sz w:val="12"/>
+                <w:szCs w:val="12"/>
+              </w:rPr>
+            </w:pPr>
+            <w:r>
+              <w:rPr>
+                <w:rFonts w:cs="Times New Roman"/>
+                <w:noProof/>
+                <w:color w:val="auto"/>
+                <w:kern w:val="2"/>
+                <w:sz w:val="12"/>
+                <w:szCs w:val="12"/>
+              </w:rPr>
+              <w:lastRenderedPageBreak/>
+              <w:pict w14:anchorId="2384C7EB">
+                <v:shape id="_x0000_i1041" type="#_x0000_t75" style="width:106.1pt;height:231.15pt;visibility:visible;mso-wrap-style:square">
+                  <v:imagedata r:id="rId24" o:title=""/>
+                </v:shape>
+              </w:pict>
+            </w:r>
+          </w:p>
+        </w:tc>
+      </w:tr>
+      <w:tr>
+        <w:trPr>
+          <w:trHeight w:val="655"/>
+        </w:trPr>
+        <w:tc>
+          <w:tcPr>
+            <w:tcW w:w="595" w:type="dxa"/>
+            <w:vAlign w:val="center"/>
+          </w:tcPr>
+          <w:p>
+            <w:pPr>
+              <w:jc w:val="center"/>
+              <w:rPr>
+                <w:sz w:val="12"/>
+                <w:szCs w:val="12"/>
+              </w:rPr>
+            </w:pPr>
+            <w:r>
+              <w:rPr>
+                <w:rFonts w:hint="eastAsia"/>
+                <w:sz w:val="12"/>
+                <w:szCs w:val="12"/>
+              </w:rPr>
+              <w:lastRenderedPageBreak/>
+              <w:t>15</w:t>
+            </w:r>
+          </w:p>
+        </w:tc>
+        <w:tc>
+          <w:tcPr>
+            <w:tcW w:w="603" w:type="dxa"/>
+            <w:vAlign w:val="center"/>
+          </w:tcPr>
+          <w:p>
+            <w:pPr>
+              <w:jc w:val="center"/>
+              <w:rPr>
+                <w:sz w:val="12"/>
+                <w:szCs w:val="12"/>
+              </w:rPr>
+            </w:pPr>
+          </w:p>
+        </w:tc>
+        <w:tc>
+          <w:tcPr>
+            <w:tcW w:w="1382" w:type="dxa"/>
+          </w:tcPr>
+          <w:p>
+            <w:pPr>
+              <w:jc w:val="left"/>
+              <w:rPr>
+                <w:sz w:val="12"/>
+                <w:szCs w:val="12"/>
+              </w:rPr>
+            </w:pPr>
+            <w:r>
+              <w:rPr>
+                <w:rFonts w:hint="eastAsia"/>
+                <w:sz w:val="12"/>
+                <w:szCs w:val="12"/>
+              </w:rPr>
+              <w:t xml:space="preserve">2. </w:t>
+            </w:r>
+            <w:r>
+              <w:rPr>
+                <w:sz w:val="12"/>
+                <w:szCs w:val="12"/>
+              </w:rPr>
+              <w:t>게시물 목록 위치 기억 및 이어보기</w:t>
+            </w:r>
+            <w:r>
+              <w:rPr>
+                <w:rFonts w:hint="eastAsia"/>
+                <w:sz w:val="12"/>
+                <w:szCs w:val="12"/>
+              </w:rPr>
+              <w:t>(Client)</w:t>
             </w:r>
           </w:p>
         </w:tc>
@@ -3975,27 +5217,42 @@
             </w:pPr>
             <w:r>
               <w:rPr>
-                <w:rFonts w:hint="eastAsia"/>
                 <w:sz w:val="12"/>
                 <w:szCs w:val="12"/>
               </w:rPr>
-              <w:t>제출 : 해당 기능 정의, 설명 및 동작 증빙 화면 캡처</w:t>
+              <w:t xml:space="preserve">사용자가 게시물 목록을 탐색하던 중 게시물 작성 화면이나 다른 화면으로 이동하거나 앱 사용을 일시적으로 중단한 경우, 이전에 보고 있던 </w:t>
             </w:r>
-          </w:p>
-          <w:p>
-            <w:pPr>
+            <w:proofErr w:type="spellStart"/>
+            <w:r>
               <w:rPr>
                 <w:sz w:val="12"/>
                 <w:szCs w:val="12"/>
               </w:rPr>
-            </w:pPr>
+              <w:t>RecyclerView</w:t>
+            </w:r>
+            <w:proofErr w:type="spellEnd"/>
             <w:r>
               <w:rPr>
-                <w:rFonts w:hint="eastAsia"/>
                 <w:sz w:val="12"/>
                 <w:szCs w:val="12"/>
               </w:rPr>
-              <w:t>(서버/클라이언트 각각 구현이 필요한 경우 별도 요구사항으로 등록 함)</w:t>
+              <w:t xml:space="preserve">의 위치와 화면 내 스크롤 오프셋을 자동으로 저장하도록 구현하였다. 사용자가 다시 게시물 목록으로 돌아오면 서버 동기화가 완료된 이후 저장된 위치를 자동으로 복원하여, 처음부터 다시 스크롤하며 이전 게시물을 찾지 않아도 되도록 하였다. 또한 서버 게시물 수가 변경되어 기존 위치를 그대로 사용할 수 없는 경우 현재 목록 범위 내에서 유효한 위치로 보정하도록 처리하였다. 이를 통해 긴 게시물 목록에서 발생하는 </w:t>
+            </w:r>
+            <w:proofErr w:type="spellStart"/>
+            <w:r>
+              <w:rPr>
+                <w:sz w:val="12"/>
+                <w:szCs w:val="12"/>
+              </w:rPr>
+              <w:t>재탐색</w:t>
+            </w:r>
+            <w:proofErr w:type="spellEnd"/>
+            <w:r>
+              <w:rPr>
+                <w:sz w:val="12"/>
+                <w:szCs w:val="12"/>
+              </w:rPr>
+              <w:t xml:space="preserve"> 시간과 반복 스크롤 조작을 줄이고, 사용자가 이전 탐색 흐름을 자연스럽게 이어갈 수 있도록 개선하였다.</w:t>
             </w:r>
           </w:p>
         </w:tc>
@@ -4044,6 +5301,21 @@
                 <w:szCs w:val="12"/>
               </w:rPr>
             </w:pPr>
+            <w:r>
+              <w:rPr>
+                <w:rFonts w:cs="Times New Roman"/>
+                <w:noProof/>
+                <w:color w:val="auto"/>
+                <w:kern w:val="2"/>
+                <w:sz w:val="12"/>
+                <w:szCs w:val="12"/>
+              </w:rPr>
+              <w:pict w14:anchorId="20C1007E">
+                <v:shape id="_x0000_i1042" type="#_x0000_t75" style="width:106.1pt;height:223.6pt;visibility:visible;mso-wrap-style:square">
+                  <v:imagedata r:id="rId25" o:title=""/>
+                </v:shape>
+              </w:pict>
+            </w:r>
           </w:p>
         </w:tc>
       </w:tr>
@@ -4064,6 +5336,14 @@
                 <w:szCs w:val="12"/>
               </w:rPr>
             </w:pPr>
+            <w:r>
+              <w:rPr>
+                <w:rFonts w:hint="eastAsia"/>
+                <w:sz w:val="12"/>
+                <w:szCs w:val="12"/>
+              </w:rPr>
+              <w:t>16</w:t>
+            </w:r>
           </w:p>
         </w:tc>
         <w:tc>
@@ -4093,6 +5373,324 @@
                 <w:szCs w:val="12"/>
               </w:rPr>
             </w:pPr>
+            <w:r>
+              <w:rPr>
+                <w:rFonts w:hint="eastAsia"/>
+                <w:sz w:val="12"/>
+                <w:szCs w:val="12"/>
+              </w:rPr>
+              <w:t>3,</w:t>
+            </w:r>
+            <w:r>
+              <w:rPr>
+                <w:rFonts w:hint="eastAsia"/>
+              </w:rPr>
+              <w:t xml:space="preserve"> </w:t>
+            </w:r>
+            <w:r>
+              <w:rPr>
+                <w:sz w:val="12"/>
+                <w:szCs w:val="12"/>
+              </w:rPr>
+              <w:t>게시물 검색 및 정렬 REST API</w:t>
+            </w:r>
+            <w:r>
+              <w:rPr>
+                <w:rFonts w:hint="eastAsia"/>
+                <w:sz w:val="12"/>
+                <w:szCs w:val="12"/>
+              </w:rPr>
+              <w:t>(Server)</w:t>
+            </w:r>
+          </w:p>
+        </w:tc>
+        <w:tc>
+          <w:tcPr>
+            <w:tcW w:w="3582" w:type="dxa"/>
+          </w:tcPr>
+          <w:p>
+            <w:pPr>
+              <w:rPr>
+                <w:sz w:val="12"/>
+                <w:szCs w:val="12"/>
+              </w:rPr>
+            </w:pPr>
+            <w:r>
+              <w:rPr>
+                <w:rFonts w:hint="eastAsia"/>
+                <w:sz w:val="12"/>
+                <w:szCs w:val="12"/>
+              </w:rPr>
+              <w:t>게시물</w:t>
+            </w:r>
+            <w:r>
+              <w:rPr>
+                <w:sz w:val="12"/>
+                <w:szCs w:val="12"/>
+              </w:rPr>
+              <w:t xml:space="preserve"> 수가 많아질 경우 사용자가 원하는 게시물을 찾기 위해 전체 목록을 직접 탐색해야 하는 불편을 줄이기 위해, Django REST Framework의 검색 및 정렬 기능을 서버 API에 추가하였다. 제목과 본문을 대상으로 키워드 검색이 가능하도록 구현하였으며, 작성일과 게시일, 제목을 기준으로 최신순, </w:t>
+            </w:r>
+            <w:proofErr w:type="spellStart"/>
+            <w:r>
+              <w:rPr>
+                <w:sz w:val="12"/>
+                <w:szCs w:val="12"/>
+              </w:rPr>
+              <w:t>오래된순</w:t>
+            </w:r>
+            <w:proofErr w:type="spellEnd"/>
+            <w:r>
+              <w:rPr>
+                <w:sz w:val="12"/>
+                <w:szCs w:val="12"/>
+              </w:rPr>
+              <w:t xml:space="preserve">, 제목순 등의 정렬을 수행할 수 있도록 하였다.  </w:t>
+            </w:r>
+          </w:p>
+          <w:p>
+            <w:pPr>
+              <w:rPr>
+                <w:sz w:val="12"/>
+                <w:szCs w:val="12"/>
+              </w:rPr>
+            </w:pPr>
+            <w:r>
+              <w:rPr>
+                <w:rFonts w:hint="eastAsia"/>
+                <w:sz w:val="12"/>
+                <w:szCs w:val="12"/>
+              </w:rPr>
+              <w:t>클라이언트는</w:t>
+            </w:r>
+            <w:r>
+              <w:rPr>
+                <w:sz w:val="12"/>
+                <w:szCs w:val="12"/>
+              </w:rPr>
+              <w:t xml:space="preserve"> 전체 게시물을 모두 </w:t>
+            </w:r>
+            <w:proofErr w:type="spellStart"/>
+            <w:r>
+              <w:rPr>
+                <w:sz w:val="12"/>
+                <w:szCs w:val="12"/>
+              </w:rPr>
+              <w:t>내려받은</w:t>
+            </w:r>
+            <w:proofErr w:type="spellEnd"/>
+            <w:r>
+              <w:rPr>
+                <w:sz w:val="12"/>
+                <w:szCs w:val="12"/>
+              </w:rPr>
+              <w:t xml:space="preserve"> 뒤 직접 필터링하는 대신, 검색어와 정렬 조건을 Query Parameter로 서버에 전달하여 조건에 맞는 데이터만 전달받을 수 있다. 이를 통해 불필요한 데이터 탐색을 줄이고, 게시물 수가 증가한 상황에서도 원하는 게시물을 보다 빠르게 조회할 수 있도록 개선하였다.</w:t>
+            </w:r>
+          </w:p>
+        </w:tc>
+        <w:tc>
+          <w:tcPr>
+            <w:tcW w:w="484" w:type="dxa"/>
+            <w:vAlign w:val="center"/>
+          </w:tcPr>
+          <w:p>
+            <w:pPr>
+              <w:jc w:val="center"/>
+              <w:rPr>
+                <w:sz w:val="12"/>
+                <w:szCs w:val="12"/>
+              </w:rPr>
+            </w:pPr>
+          </w:p>
+        </w:tc>
+        <w:tc>
+          <w:tcPr>
+            <w:tcW w:w="426" w:type="dxa"/>
+            <w:vAlign w:val="center"/>
+          </w:tcPr>
+          <w:p>
+            <w:pPr>
+              <w:jc w:val="center"/>
+              <w:rPr>
+                <w:sz w:val="12"/>
+                <w:szCs w:val="12"/>
+              </w:rPr>
+            </w:pPr>
+          </w:p>
+        </w:tc>
+        <w:tc>
+          <w:tcPr>
+            <w:tcW w:w="2173" w:type="dxa"/>
+            <w:vAlign w:val="center"/>
+          </w:tcPr>
+          <w:p>
+            <w:pPr>
+              <w:rPr>
+                <w:rFonts w:cs="Times New Roman"/>
+                <w:noProof/>
+                <w:color w:val="auto"/>
+                <w:kern w:val="2"/>
+                <w:sz w:val="12"/>
+                <w:szCs w:val="12"/>
+              </w:rPr>
+            </w:pPr>
+          </w:p>
+          <w:p>
+            <w:pPr>
+              <w:rPr>
+                <w:rFonts w:cs="Times New Roman"/>
+                <w:noProof/>
+                <w:color w:val="auto"/>
+                <w:kern w:val="2"/>
+                <w:sz w:val="12"/>
+                <w:szCs w:val="12"/>
+              </w:rPr>
+            </w:pPr>
+            <w:r>
+              <w:rPr>
+                <w:rFonts w:cs="Times New Roman"/>
+                <w:noProof/>
+                <w:color w:val="auto"/>
+                <w:kern w:val="2"/>
+                <w:sz w:val="12"/>
+                <w:szCs w:val="12"/>
+              </w:rPr>
+              <w:pict w14:anchorId="177C1A67">
+                <v:shape id="_x0000_i1043" type="#_x0000_t75" style="width:106.1pt;height:90.95pt;visibility:visible;mso-wrap-style:square">
+                  <v:imagedata r:id="rId26" o:title=""/>
+                </v:shape>
+              </w:pict>
+            </w:r>
+          </w:p>
+          <w:p>
+            <w:pPr>
+              <w:rPr>
+                <w:rFonts w:cs="Times New Roman"/>
+                <w:noProof/>
+                <w:color w:val="auto"/>
+                <w:kern w:val="2"/>
+                <w:sz w:val="12"/>
+                <w:szCs w:val="12"/>
+              </w:rPr>
+            </w:pPr>
+            <w:r>
+              <w:rPr>
+                <w:rFonts w:cs="Times New Roman"/>
+                <w:noProof/>
+                <w:color w:val="auto"/>
+                <w:kern w:val="2"/>
+                <w:sz w:val="12"/>
+                <w:szCs w:val="12"/>
+              </w:rPr>
+              <w:pict w14:anchorId="259D21D7">
+                <v:shape id="_x0000_i1044" type="#_x0000_t75" style="width:106.1pt;height:79.6pt;visibility:visible;mso-wrap-style:square">
+                  <v:imagedata r:id="rId27" o:title=""/>
+                </v:shape>
+              </w:pict>
+            </w:r>
+          </w:p>
+          <w:p>
+            <w:pPr>
+              <w:rPr>
+                <w:rFonts w:cs="Times New Roman"/>
+                <w:noProof/>
+                <w:color w:val="auto"/>
+                <w:kern w:val="2"/>
+                <w:sz w:val="12"/>
+                <w:szCs w:val="12"/>
+              </w:rPr>
+            </w:pPr>
+          </w:p>
+          <w:p>
+            <w:pPr>
+              <w:rPr>
+                <w:rFonts w:cs="Times New Roman"/>
+                <w:color w:val="auto"/>
+                <w:kern w:val="2"/>
+                <w:sz w:val="12"/>
+                <w:szCs w:val="12"/>
+              </w:rPr>
+            </w:pPr>
+            <w:r>
+              <w:rPr>
+                <w:rFonts w:cs="Times New Roman"/>
+                <w:noProof/>
+                <w:color w:val="auto"/>
+                <w:kern w:val="2"/>
+                <w:sz w:val="12"/>
+                <w:szCs w:val="12"/>
+              </w:rPr>
+              <w:pict w14:anchorId="2B1F8E9E">
+                <v:shape id="_x0000_i1045" type="#_x0000_t75" style="width:106.1pt;height:68.2pt;visibility:visible;mso-wrap-style:square">
+                  <v:imagedata r:id="rId28" o:title=""/>
+                </v:shape>
+              </w:pict>
+            </w:r>
+          </w:p>
+        </w:tc>
+      </w:tr>
+      <w:tr>
+        <w:trPr>
+          <w:trHeight w:val="655"/>
+        </w:trPr>
+        <w:tc>
+          <w:tcPr>
+            <w:tcW w:w="595" w:type="dxa"/>
+            <w:vAlign w:val="center"/>
+          </w:tcPr>
+          <w:p>
+            <w:pPr>
+              <w:jc w:val="center"/>
+              <w:rPr>
+                <w:sz w:val="12"/>
+                <w:szCs w:val="12"/>
+              </w:rPr>
+            </w:pPr>
+            <w:r>
+              <w:rPr>
+                <w:rFonts w:hint="eastAsia"/>
+                <w:sz w:val="12"/>
+                <w:szCs w:val="12"/>
+              </w:rPr>
+              <w:lastRenderedPageBreak/>
+              <w:t>17</w:t>
+            </w:r>
+          </w:p>
+        </w:tc>
+        <w:tc>
+          <w:tcPr>
+            <w:tcW w:w="603" w:type="dxa"/>
+            <w:vAlign w:val="center"/>
+          </w:tcPr>
+          <w:p>
+            <w:pPr>
+              <w:jc w:val="center"/>
+              <w:rPr>
+                <w:sz w:val="12"/>
+                <w:szCs w:val="12"/>
+              </w:rPr>
+            </w:pPr>
+          </w:p>
+        </w:tc>
+        <w:tc>
+          <w:tcPr>
+            <w:tcW w:w="1382" w:type="dxa"/>
+          </w:tcPr>
+          <w:p>
+            <w:pPr>
+              <w:jc w:val="left"/>
+              <w:rPr>
+                <w:sz w:val="12"/>
+                <w:szCs w:val="12"/>
+              </w:rPr>
+            </w:pPr>
+            <w:r>
+              <w:rPr>
+                <w:rFonts w:hint="eastAsia"/>
+                <w:sz w:val="12"/>
+                <w:szCs w:val="12"/>
+              </w:rPr>
+              <w:t>4.</w:t>
+            </w:r>
           </w:p>
         </w:tc>
         <w:tc>
@@ -4173,6 +5771,14 @@
                 <w:szCs w:val="12"/>
               </w:rPr>
             </w:pPr>
+            <w:r>
+              <w:rPr>
+                <w:rFonts w:hint="eastAsia"/>
+                <w:sz w:val="12"/>
+                <w:szCs w:val="12"/>
+              </w:rPr>
+              <w:t>18</w:t>
+            </w:r>
           </w:p>
         </w:tc>
         <w:tc>
@@ -4198,10 +5804,27 @@
             <w:pPr>
               <w:jc w:val="left"/>
               <w:rPr>
+                <w:rFonts w:hint="eastAsia"/>
                 <w:sz w:val="12"/>
                 <w:szCs w:val="12"/>
               </w:rPr>
             </w:pPr>
+            <w:r>
+              <w:rPr>
+                <w:rFonts w:hint="eastAsia"/>
+                <w:sz w:val="12"/>
+                <w:szCs w:val="12"/>
+              </w:rPr>
+              <w:t>5.</w:t>
+            </w:r>
+            <w:r>
+              <w:rPr>
+                <w:rFonts w:hint="eastAsia"/>
+                <w:sz w:val="12"/>
+                <w:szCs w:val="12"/>
+              </w:rPr>
+              <w:t>반복 요청 감지 및 중복 게시 방지</w:t>
+            </w:r>
           </w:p>
         </w:tc>
         <w:tc>
@@ -4215,6 +5838,13 @@
                 <w:szCs w:val="12"/>
               </w:rPr>
             </w:pPr>
+            <w:r>
+              <w:rPr>
+                <w:sz w:val="12"/>
+                <w:szCs w:val="12"/>
+              </w:rPr>
+              <w:t>사용자가 게시 버튼을 여러 번 누르거나 네트워크 지연으로 동일한 POST 요청이 반복 전송될 경우 같은 게시물이 여러 개 생성될 수 있는 문제를 방지하기 위해 서버 측 중복 요청 검사 기능을 구현하였다. 게시물 생성 요청이 들어오면 서버는 최근 10초 이내에 동일한 작성자, 제목, 본문을 가진 게시물이 존재하는지 확인한다. 동일한 게시물이 없으면 정상적으로 게시물을 생성하고 HTTP 201 Created를 반환하며, 이미 동일한 게시물이 존재하면 새로운 게시물을 생성하지 않고 HTTP 409 Conflict를 반환하도록 처리하였다. 이를 통해 사용자의 반복 입력이나 통신 지연으로 발생할 수 있는 중복 데이터를 사전에 방지하고, 서버 데이터의 일관성을 유지할 수 있도록 개선하였다.</w:t>
+            </w:r>
           </w:p>
         </w:tc>
         <w:tc>
@@ -4262,224 +5892,21 @@
                 <w:szCs w:val="12"/>
               </w:rPr>
             </w:pPr>
-          </w:p>
-        </w:tc>
-      </w:tr>
-      <w:tr>
-        <w:trPr>
-          <w:trHeight w:val="655"/>
-        </w:trPr>
-        <w:tc>
-          <w:tcPr>
-            <w:tcW w:w="595" w:type="dxa"/>
-            <w:vAlign w:val="center"/>
-          </w:tcPr>
-          <w:p>
-            <w:pPr>
-              <w:jc w:val="center"/>
-              <w:rPr>
-                <w:sz w:val="12"/>
-                <w:szCs w:val="12"/>
-              </w:rPr>
-            </w:pPr>
-          </w:p>
-        </w:tc>
-        <w:tc>
-          <w:tcPr>
-            <w:tcW w:w="603" w:type="dxa"/>
-            <w:vAlign w:val="center"/>
-          </w:tcPr>
-          <w:p>
-            <w:pPr>
-              <w:jc w:val="center"/>
-              <w:rPr>
-                <w:sz w:val="12"/>
-                <w:szCs w:val="12"/>
-              </w:rPr>
-            </w:pPr>
-          </w:p>
-        </w:tc>
-        <w:tc>
-          <w:tcPr>
-            <w:tcW w:w="1382" w:type="dxa"/>
-          </w:tcPr>
-          <w:p>
-            <w:pPr>
-              <w:jc w:val="left"/>
-              <w:rPr>
-                <w:sz w:val="12"/>
-                <w:szCs w:val="12"/>
-              </w:rPr>
-            </w:pPr>
-          </w:p>
-        </w:tc>
-        <w:tc>
-          <w:tcPr>
-            <w:tcW w:w="3582" w:type="dxa"/>
-          </w:tcPr>
-          <w:p>
-            <w:pPr>
-              <w:rPr>
-                <w:sz w:val="12"/>
-                <w:szCs w:val="12"/>
-              </w:rPr>
-            </w:pPr>
-          </w:p>
-        </w:tc>
-        <w:tc>
-          <w:tcPr>
-            <w:tcW w:w="484" w:type="dxa"/>
-            <w:vAlign w:val="center"/>
-          </w:tcPr>
-          <w:p>
-            <w:pPr>
-              <w:jc w:val="center"/>
-              <w:rPr>
-                <w:sz w:val="12"/>
-                <w:szCs w:val="12"/>
-              </w:rPr>
-            </w:pPr>
-          </w:p>
-        </w:tc>
-        <w:tc>
-          <w:tcPr>
-            <w:tcW w:w="426" w:type="dxa"/>
-            <w:vAlign w:val="center"/>
-          </w:tcPr>
-          <w:p>
-            <w:pPr>
-              <w:jc w:val="center"/>
-              <w:rPr>
-                <w:sz w:val="12"/>
-                <w:szCs w:val="12"/>
-              </w:rPr>
-            </w:pPr>
-          </w:p>
-        </w:tc>
-        <w:tc>
-          <w:tcPr>
-            <w:tcW w:w="2173" w:type="dxa"/>
-            <w:vAlign w:val="center"/>
-          </w:tcPr>
-          <w:p>
-            <w:pPr>
+            <w:r>
               <w:rPr>
                 <w:rFonts w:cs="Times New Roman"/>
+                <w:noProof/>
                 <w:color w:val="auto"/>
                 <w:kern w:val="2"/>
                 <w:sz w:val="12"/>
                 <w:szCs w:val="12"/>
               </w:rPr>
-            </w:pPr>
-          </w:p>
-        </w:tc>
-      </w:tr>
-      <w:tr>
-        <w:trPr>
-          <w:trHeight w:val="655"/>
-        </w:trPr>
-        <w:tc>
-          <w:tcPr>
-            <w:tcW w:w="595" w:type="dxa"/>
-            <w:vAlign w:val="center"/>
-          </w:tcPr>
-          <w:p>
-            <w:pPr>
-              <w:jc w:val="center"/>
-              <w:rPr>
-                <w:sz w:val="12"/>
-                <w:szCs w:val="12"/>
-              </w:rPr>
-            </w:pPr>
-          </w:p>
-        </w:tc>
-        <w:tc>
-          <w:tcPr>
-            <w:tcW w:w="603" w:type="dxa"/>
-            <w:vAlign w:val="center"/>
-          </w:tcPr>
-          <w:p>
-            <w:pPr>
-              <w:jc w:val="center"/>
-              <w:rPr>
-                <w:sz w:val="12"/>
-                <w:szCs w:val="12"/>
-              </w:rPr>
-            </w:pPr>
-          </w:p>
-        </w:tc>
-        <w:tc>
-          <w:tcPr>
-            <w:tcW w:w="1382" w:type="dxa"/>
-          </w:tcPr>
-          <w:p>
-            <w:pPr>
-              <w:jc w:val="left"/>
-              <w:rPr>
-                <w:sz w:val="12"/>
-                <w:szCs w:val="12"/>
-              </w:rPr>
-            </w:pPr>
-          </w:p>
-        </w:tc>
-        <w:tc>
-          <w:tcPr>
-            <w:tcW w:w="3582" w:type="dxa"/>
-          </w:tcPr>
-          <w:p>
-            <w:pPr>
-              <w:rPr>
-                <w:sz w:val="12"/>
-                <w:szCs w:val="12"/>
-              </w:rPr>
-            </w:pPr>
-          </w:p>
-        </w:tc>
-        <w:tc>
-          <w:tcPr>
-            <w:tcW w:w="484" w:type="dxa"/>
-            <w:vAlign w:val="center"/>
-          </w:tcPr>
-          <w:p>
-            <w:pPr>
-              <w:jc w:val="center"/>
-              <w:rPr>
-                <w:sz w:val="12"/>
-                <w:szCs w:val="12"/>
-              </w:rPr>
-            </w:pPr>
-          </w:p>
-        </w:tc>
-        <w:tc>
-          <w:tcPr>
-            <w:tcW w:w="426" w:type="dxa"/>
-            <w:vAlign w:val="center"/>
-          </w:tcPr>
-          <w:p>
-            <w:pPr>
-              <w:jc w:val="center"/>
-              <w:rPr>
-                <w:sz w:val="12"/>
-                <w:szCs w:val="12"/>
-              </w:rPr>
-            </w:pPr>
-          </w:p>
-        </w:tc>
-        <w:tc>
-          <w:tcPr>
-            <w:tcW w:w="2173" w:type="dxa"/>
-            <w:vAlign w:val="center"/>
-          </w:tcPr>
-          <w:p>
-            <w:pPr>
-              <w:rPr>
-                <w:rFonts w:cs="Times New Roman"/>
-                <w:color w:val="auto"/>
-                <w:kern w:val="2"/>
-                <w:sz w:val="12"/>
-                <w:szCs w:val="12"/>
-              </w:rPr>
-            </w:pPr>
+              <w:pict w14:anchorId="6CBF56FD">
+                <v:shape id="_x0000_i1046" type="#_x0000_t75" style="width:106.1pt;height:68.2pt;visibility:visible;mso-wrap-style:square">
+                  <v:imagedata r:id="rId29" o:title=""/>
+                </v:shape>
+              </w:pict>
+            </w:r>
           </w:p>
         </w:tc>
       </w:tr>
@@ -4498,9 +5925,9 @@
       </w:pPr>
     </w:p>
     <w:sectPr>
-      <w:headerReference w:type="default" r:id="rId9"/>
-      <w:footerReference w:type="even" r:id="rId10"/>
-      <w:footerReference w:type="default" r:id="rId11"/>
+      <w:headerReference w:type="default" r:id="rId30"/>
+      <w:footerReference w:type="even" r:id="rId31"/>
+      <w:footerReference w:type="default" r:id="rId32"/>
       <w:footnotePr>
         <w:numRestart w:val="eachSect"/>
       </w:footnotePr>
@@ -4671,7 +6098,6 @@
       <w:rPr>
         <w:rFonts w:hint="eastAsia"/>
         <w:sz w:val="20"/>
-        <w:lang w:eastAsia="ko-KR"/>
       </w:rPr>
       <w:t>2</w:t>
     </w:r>
@@ -4679,7 +6105,6 @@
       <w:rPr>
         <w:rFonts w:hint="eastAsia"/>
         <w:sz w:val="20"/>
-        <w:lang w:eastAsia="ko-KR"/>
       </w:rPr>
       <w:t>6</w:t>
     </w:r>
@@ -4694,7 +6119,6 @@
       <w:rPr>
         <w:rFonts w:hint="eastAsia"/>
         <w:sz w:val="20"/>
-        <w:lang w:eastAsia="ko-KR"/>
       </w:rPr>
       <w:t xml:space="preserve">2학기 </w:t>
     </w:r>
@@ -4702,15 +6126,29 @@
       <w:rPr>
         <w:rFonts w:hint="eastAsia"/>
         <w:sz w:val="20"/>
-        <w:lang w:eastAsia="ko-KR"/>
       </w:rPr>
-      <w:t>모바일/웹서비스 프로젝트</w:t>
+      <w:t>모바일/</w:t>
+    </w:r>
+    <w:proofErr w:type="spellStart"/>
+    <w:r>
+      <w:rPr>
+        <w:rFonts w:hint="eastAsia"/>
+        <w:sz w:val="20"/>
+      </w:rPr>
+      <w:t>웹서비스</w:t>
+    </w:r>
+    <w:proofErr w:type="spellEnd"/>
+    <w:r>
+      <w:rPr>
+        <w:rFonts w:hint="eastAsia"/>
+        <w:sz w:val="20"/>
+      </w:rPr>
+      <w:t xml:space="preserve"> 프로젝트</w:t>
     </w:r>
     <w:r>
       <w:rPr>
         <w:rFonts w:hint="eastAsia"/>
         <w:sz w:val="20"/>
-        <w:lang w:eastAsia="ko-KR"/>
       </w:rPr>
       <w:t>]</w:t>
     </w:r>
@@ -4727,7 +6165,6 @@
         <w:rFonts w:hint="eastAsia"/>
         <w:bCs/>
         <w:sz w:val="20"/>
-        <w:lang w:eastAsia="ko-KR"/>
       </w:rPr>
       <w:t xml:space="preserve">공통평가 01 </w:t>
     </w:r>
@@ -4766,7 +6203,7 @@
         <v:path o:extrusionok="f" gradientshapeok="t" o:connecttype="rect"/>
         <o:lock v:ext="edit" aspectratio="t"/>
       </v:shapetype>
-      <v:shape id="_x0000_i1025" type="#_x0000_t75" style="width:6.4pt;height:6.4pt" o:bullet="t">
+      <v:shape id="_x0000_i1025" type="#_x0000_t75" style="width:7.6pt;height:7.6pt" o:bullet="t">
         <v:imagedata r:id="rId1" o:title="BD10267_"/>
       </v:shape>
     </w:pict>
@@ -16875,7 +18312,6 @@
     </w:pPr>
     <w:rPr>
       <w:szCs w:val="22"/>
-      <w:lang/>
     </w:rPr>
   </w:style>
   <w:style w:type="paragraph" w:customStyle="1" w:styleId="aff0">
@@ -16978,7 +18414,6 @@
     <w:rPr>
       <w:b/>
       <w:bCs/>
-      <w:lang/>
     </w:rPr>
   </w:style>
   <w:style w:type="character" w:customStyle="1" w:styleId="1b">
@@ -17290,7 +18725,6 @@
       <w:color w:val="000000"/>
       <w:sz w:val="24"/>
       <w:szCs w:val="24"/>
-      <w:lang/>
     </w:rPr>
   </w:style>
   <w:style w:type="character" w:customStyle="1" w:styleId="afff0">
@@ -17650,7 +19084,6 @@
       <w:kern w:val="0"/>
       <w:sz w:val="48"/>
       <w:szCs w:val="48"/>
-      <w:lang w:eastAsia="ko-KR"/>
     </w:rPr>
   </w:style>
   <w:style w:type="character" w:customStyle="1" w:styleId="affff1">
@@ -17719,7 +19152,6 @@
       <w:kern w:val="0"/>
       <w:sz w:val="40"/>
       <w:szCs w:val="40"/>
-      <w:lang w:eastAsia="ko-KR"/>
     </w:rPr>
   </w:style>
   <w:style w:type="paragraph" w:customStyle="1" w:styleId="affff3">
@@ -20849,7 +22281,6 @@
     <w:rPr>
       <w:rFonts w:hAnsi="바탕"/>
       <w:kern w:val="2"/>
-      <w:lang/>
     </w:rPr>
   </w:style>
   <w:style w:type="character" w:customStyle="1" w:styleId="2Char3">
@@ -21569,7 +23000,6 @@
       <w:rFonts w:eastAsia="바탕"/>
       <w:sz w:val="22"/>
       <w:szCs w:val="22"/>
-      <w:lang/>
     </w:rPr>
   </w:style>
   <w:style w:type="character" w:customStyle="1" w:styleId="Chard">
@@ -23559,9 +24989,6 @@
     <w:pPr>
       <w:ind w:leftChars="100" w:left="750" w:hangingChars="250" w:hanging="550"/>
     </w:pPr>
-    <w:rPr>
-      <w:lang/>
-    </w:rPr>
   </w:style>
   <w:style w:type="paragraph" w:customStyle="1" w:styleId="affffffff6">
     <w:name w:val="번호 가)"/>
@@ -26596,7 +28023,6 @@
     <w:rPr>
       <w:rFonts w:hAnsi="Times New Roman"/>
       <w:color w:val="auto"/>
-      <w:lang w:eastAsia="ko-KR"/>
     </w:rPr>
   </w:style>
   <w:style w:type="paragraph" w:customStyle="1" w:styleId="2f6">
@@ -26664,7 +28090,6 @@
       <w:rFonts w:cs="바탕"/>
       <w:color w:val="000000"/>
       <w:kern w:val="0"/>
-      <w:lang w:eastAsia="ko-KR"/>
     </w:rPr>
   </w:style>
   <w:style w:type="paragraph" w:customStyle="1" w:styleId="119">
@@ -26716,7 +28141,6 @@
       <w:rFonts w:cs="바탕"/>
       <w:color w:val="000000"/>
       <w:kern w:val="0"/>
-      <w:lang w:eastAsia="ko-KR"/>
     </w:rPr>
   </w:style>
   <w:style w:type="paragraph" w:customStyle="1" w:styleId="1ffa">
@@ -27042,7 +28466,6 @@
     <w:rPr>
       <w:sz w:val="24"/>
       <w:szCs w:val="22"/>
-      <w:lang/>
     </w:rPr>
   </w:style>
   <w:style w:type="paragraph" w:customStyle="1" w:styleId="2f8">
@@ -27103,7 +28526,6 @@
     <w:rPr>
       <w:bCs/>
       <w:szCs w:val="22"/>
-      <w:lang/>
     </w:rPr>
   </w:style>
   <w:style w:type="paragraph" w:customStyle="1" w:styleId="List1">
@@ -27787,7 +29209,6 @@
     <w:rPr>
       <w:color w:val="000000"/>
       <w:kern w:val="0"/>
-      <w:lang w:eastAsia="ko-KR"/>
     </w:rPr>
   </w:style>
   <w:style w:type="paragraph" w:customStyle="1" w:styleId="57">
@@ -31325,7 +32746,6 @@
     </w:pPr>
     <w:rPr>
       <w:rFonts w:ascii="바탕" w:eastAsia="바탕" w:hAnsi="바탕"/>
-      <w:lang/>
     </w:rPr>
   </w:style>
   <w:style w:type="paragraph" w:customStyle="1" w:styleId="11point">
@@ -31597,7 +33017,6 @@
     <w:rPr>
       <w:rFonts w:hAnsi="Times New Roman"/>
       <w:color w:val="auto"/>
-      <w:lang w:eastAsia="ko-KR"/>
     </w:rPr>
   </w:style>
   <w:style w:type="paragraph" w:customStyle="1" w:styleId="85">
@@ -31611,7 +33030,6 @@
     <w:rPr>
       <w:rFonts w:hAnsi="Times New Roman"/>
       <w:color w:val="auto"/>
-      <w:lang w:eastAsia="ko-KR"/>
     </w:rPr>
   </w:style>
   <w:style w:type="paragraph" w:customStyle="1" w:styleId="96">
@@ -31625,7 +33043,6 @@
     <w:rPr>
       <w:rFonts w:hAnsi="Times New Roman"/>
       <w:color w:val="auto"/>
-      <w:lang w:eastAsia="ko-KR"/>
     </w:rPr>
   </w:style>
   <w:style w:type="paragraph" w:customStyle="1" w:styleId="435227">
@@ -32399,7 +33816,6 @@
       <w:kern w:val="2"/>
       <w:sz w:val="22"/>
       <w:szCs w:val="22"/>
-      <w:lang/>
     </w:rPr>
   </w:style>
   <w:style w:type="paragraph" w:customStyle="1" w:styleId="afffffffffffffff8">
@@ -32539,7 +33955,6 @@
     <w:rPr>
       <w:kern w:val="2"/>
       <w:sz w:val="22"/>
-      <w:lang/>
     </w:rPr>
   </w:style>
   <w:style w:type="character" w:customStyle="1" w:styleId="1Char6">
@@ -33113,7 +34528,6 @@
       <w:rFonts w:ascii="바탕" w:eastAsia="바탕" w:hAnsi="바탕"/>
       <w:bCs/>
       <w:szCs w:val="24"/>
-      <w:lang/>
     </w:rPr>
   </w:style>
   <w:style w:type="paragraph" w:customStyle="1" w:styleId="affffffffffffffff0">
@@ -33699,7 +35113,6 @@
       <w:b/>
       <w:bCs/>
       <w:color w:val="auto"/>
-      <w:lang/>
     </w:rPr>
   </w:style>
   <w:style w:type="paragraph" w:customStyle="1" w:styleId="Arial16pt13pt">

</xml_diff>

<commit_message>
Edit the docs file
</commit_message>
<xml_diff>
--- a/모바일웹서비스 프로젝트_공통평가 01_수행 결과 보고서.docx
+++ b/모바일웹서비스 프로젝트_공통평가 01_수행 결과 보고서.docx
@@ -1181,6 +1181,14 @@
                 <w:szCs w:val="12"/>
               </w:rPr>
             </w:pPr>
+            <w:r>
+              <w:rPr>
+                <w:rFonts w:hint="eastAsia"/>
+                <w:sz w:val="18"/>
+                <w:szCs w:val="18"/>
+              </w:rPr>
+              <w:t>○</w:t>
+            </w:r>
           </w:p>
         </w:tc>
         <w:tc>
@@ -1224,7 +1232,7 @@
                 <w:szCs w:val="12"/>
               </w:rPr>
               <w:pict w14:anchorId="2AAB56C5">
-                <v:shape id="그림 1" o:spid="_x0000_i1026" type="#_x0000_t75" style="width:106.1pt;height:30.3pt;visibility:visible;mso-wrap-style:square">
+                <v:shape id="그림 1" o:spid="_x0000_i1026" type="#_x0000_t75" style="width:106.15pt;height:30.4pt;visibility:visible;mso-wrap-style:square">
                   <v:imagedata r:id="rId8" o:title=""/>
                 </v:shape>
               </w:pict>
@@ -1460,6 +1468,14 @@
                 <w:szCs w:val="12"/>
               </w:rPr>
             </w:pPr>
+            <w:r>
+              <w:rPr>
+                <w:rFonts w:hint="eastAsia"/>
+                <w:sz w:val="18"/>
+                <w:szCs w:val="18"/>
+              </w:rPr>
+              <w:t>○</w:t>
+            </w:r>
           </w:p>
         </w:tc>
         <w:tc>
@@ -1828,6 +1844,14 @@
                 <w:szCs w:val="12"/>
               </w:rPr>
             </w:pPr>
+            <w:r>
+              <w:rPr>
+                <w:rFonts w:hint="eastAsia"/>
+                <w:sz w:val="18"/>
+                <w:szCs w:val="18"/>
+              </w:rPr>
+              <w:t>○</w:t>
+            </w:r>
           </w:p>
         </w:tc>
         <w:tc>
@@ -1871,7 +1895,7 @@
                 <w:szCs w:val="12"/>
               </w:rPr>
               <w:pict w14:anchorId="08AE8DA7">
-                <v:shape id="_x0000_i1027" type="#_x0000_t75" style="width:106.1pt;height:64.4pt;visibility:visible;mso-wrap-style:square">
+                <v:shape id="_x0000_i1027" type="#_x0000_t75" style="width:106.15pt;height:64.15pt;visibility:visible;mso-wrap-style:square">
                   <v:imagedata r:id="rId9" o:title=""/>
                 </v:shape>
               </w:pict>
@@ -1897,7 +1921,7 @@
                 <w:szCs w:val="12"/>
               </w:rPr>
               <w:pict w14:anchorId="34A77037">
-                <v:shape id="_x0000_i1028" type="#_x0000_t75" style="width:106.1pt;height:45.45pt;visibility:visible;mso-wrap-style:square">
+                <v:shape id="_x0000_i1028" type="#_x0000_t75" style="width:106.15pt;height:45.4pt;visibility:visible;mso-wrap-style:square">
                   <v:imagedata r:id="rId10" o:title=""/>
                 </v:shape>
               </w:pict>
@@ -2089,6 +2113,14 @@
                 <w:szCs w:val="12"/>
               </w:rPr>
             </w:pPr>
+            <w:r>
+              <w:rPr>
+                <w:rFonts w:hint="eastAsia"/>
+                <w:sz w:val="18"/>
+                <w:szCs w:val="18"/>
+              </w:rPr>
+              <w:t>○</w:t>
+            </w:r>
           </w:p>
         </w:tc>
         <w:tc>
@@ -2131,7 +2163,7 @@
                 <w:szCs w:val="12"/>
               </w:rPr>
               <w:pict w14:anchorId="0FC2BE79">
-                <v:shape id="_x0000_i1029" type="#_x0000_t75" style="width:106.1pt;height:26.55pt;visibility:visible;mso-wrap-style:square">
+                <v:shape id="_x0000_i1029" type="#_x0000_t75" style="width:105.75pt;height:26.65pt;visibility:visible;mso-wrap-style:square">
                   <v:imagedata r:id="rId11" o:title=""/>
                 </v:shape>
               </w:pict>
@@ -2338,6 +2370,14 @@
                 <w:szCs w:val="12"/>
               </w:rPr>
             </w:pPr>
+            <w:r>
+              <w:rPr>
+                <w:rFonts w:hint="eastAsia"/>
+                <w:sz w:val="18"/>
+                <w:szCs w:val="18"/>
+              </w:rPr>
+              <w:t>○</w:t>
+            </w:r>
           </w:p>
         </w:tc>
         <w:tc>
@@ -2380,7 +2420,7 @@
                 <w:szCs w:val="12"/>
               </w:rPr>
               <w:pict w14:anchorId="5481F081">
-                <v:shape id="_x0000_i1030" type="#_x0000_t75" style="width:106.1pt;height:45.45pt;visibility:visible;mso-wrap-style:square">
+                <v:shape id="_x0000_i1030" type="#_x0000_t75" style="width:106.15pt;height:45.75pt;visibility:visible;mso-wrap-style:square">
                   <v:imagedata r:id="rId13" o:title=""/>
                 </v:shape>
               </w:pict>
@@ -2622,6 +2662,14 @@
                 <w:szCs w:val="12"/>
               </w:rPr>
             </w:pPr>
+            <w:r>
+              <w:rPr>
+                <w:rFonts w:hint="eastAsia"/>
+                <w:sz w:val="18"/>
+                <w:szCs w:val="18"/>
+              </w:rPr>
+              <w:t>○</w:t>
+            </w:r>
           </w:p>
         </w:tc>
         <w:tc>
@@ -2664,7 +2712,7 @@
                 <w:szCs w:val="12"/>
               </w:rPr>
               <w:pict w14:anchorId="3EC5F922">
-                <v:shape id="_x0000_i1031" type="#_x0000_t75" style="width:106.1pt;height:41.7pt;visibility:visible;mso-wrap-style:square">
+                <v:shape id="_x0000_i1031" type="#_x0000_t75" style="width:105.75pt;height:41.65pt;visibility:visible;mso-wrap-style:square">
                   <v:imagedata r:id="rId14" o:title=""/>
                 </v:shape>
               </w:pict>
@@ -2695,7 +2743,6 @@
                 <w:sz w:val="12"/>
                 <w:szCs w:val="12"/>
               </w:rPr>
-              <w:lastRenderedPageBreak/>
               <w:t>7</w:t>
             </w:r>
           </w:p>
@@ -2790,7 +2837,16 @@
                 <w:sz w:val="12"/>
                 <w:szCs w:val="12"/>
               </w:rPr>
-              <w:t>요청 메시지</w:t>
+              <w:t>요</w:t>
+            </w:r>
+            <w:r>
+              <w:rPr>
+                <w:rFonts w:hint="eastAsia"/>
+                <w:sz w:val="12"/>
+                <w:szCs w:val="12"/>
+              </w:rPr>
+              <w:lastRenderedPageBreak/>
+              <w:t>청 메시지</w:t>
             </w:r>
             <w:r>
               <w:rPr>
@@ -2819,6 +2875,7 @@
                 <w:sz w:val="12"/>
                 <w:szCs w:val="12"/>
               </w:rPr>
+              <w:lastRenderedPageBreak/>
               <w:t>강의 자료(1) [24페이지]</w:t>
             </w:r>
             <w:r>
@@ -2853,6 +2910,7 @@
                 <w:sz w:val="12"/>
                 <w:szCs w:val="12"/>
               </w:rPr>
+              <w:lastRenderedPageBreak/>
               <w:t>제출 :</w:t>
             </w:r>
             <w:proofErr w:type="gramEnd"/>
@@ -2913,6 +2971,15 @@
                 <w:szCs w:val="12"/>
               </w:rPr>
             </w:pPr>
+            <w:r>
+              <w:rPr>
+                <w:rFonts w:hint="eastAsia"/>
+                <w:sz w:val="18"/>
+                <w:szCs w:val="18"/>
+              </w:rPr>
+              <w:lastRenderedPageBreak/>
+              <w:t>○</w:t>
+            </w:r>
           </w:p>
         </w:tc>
         <w:tc>
@@ -2955,7 +3022,7 @@
                 <w:szCs w:val="12"/>
               </w:rPr>
               <w:pict w14:anchorId="4123EEAA">
-                <v:shape id="_x0000_i1032" type="#_x0000_t75" style="width:106.1pt;height:22.75pt;visibility:visible;mso-wrap-style:square">
+                <v:shape id="_x0000_i1032" type="#_x0000_t75" style="width:106.5pt;height:22.9pt;visibility:visible;mso-wrap-style:square">
                   <v:imagedata r:id="rId15" o:title=""/>
                 </v:shape>
               </w:pict>
@@ -3158,6 +3225,14 @@
                 <w:szCs w:val="12"/>
               </w:rPr>
             </w:pPr>
+            <w:r>
+              <w:rPr>
+                <w:rFonts w:hint="eastAsia"/>
+                <w:sz w:val="18"/>
+                <w:szCs w:val="18"/>
+              </w:rPr>
+              <w:t>○</w:t>
+            </w:r>
           </w:p>
         </w:tc>
         <w:tc>
@@ -3200,7 +3275,7 @@
                 <w:szCs w:val="12"/>
               </w:rPr>
               <w:pict w14:anchorId="4C36E2DE">
-                <v:shape id="_x0000_i1033" type="#_x0000_t75" style="width:106.1pt;height:60.65pt;visibility:visible;mso-wrap-style:square">
+                <v:shape id="_x0000_i1033" type="#_x0000_t75" style="width:105.75pt;height:60.75pt;visibility:visible;mso-wrap-style:square">
                   <v:imagedata r:id="rId16" o:title=""/>
                 </v:shape>
               </w:pict>
@@ -3380,6 +3455,14 @@
                 <w:szCs w:val="12"/>
               </w:rPr>
             </w:pPr>
+            <w:r>
+              <w:rPr>
+                <w:rFonts w:hint="eastAsia"/>
+                <w:sz w:val="18"/>
+                <w:szCs w:val="18"/>
+              </w:rPr>
+              <w:t>○</w:t>
+            </w:r>
           </w:p>
         </w:tc>
         <w:tc>
@@ -3422,7 +3505,7 @@
                 <w:szCs w:val="12"/>
               </w:rPr>
               <w:pict w14:anchorId="6BDAE8AE">
-                <v:shape id="_x0000_i1034" type="#_x0000_t75" style="width:106.1pt;height:231.15pt;visibility:visible;mso-wrap-style:square">
+                <v:shape id="_x0000_i1034" type="#_x0000_t75" style="width:106.15pt;height:231pt;visibility:visible;mso-wrap-style:square">
                   <v:imagedata r:id="rId17" o:title=""/>
                 </v:shape>
               </w:pict>
@@ -3625,6 +3708,14 @@
                 <w:szCs w:val="12"/>
               </w:rPr>
             </w:pPr>
+            <w:r>
+              <w:rPr>
+                <w:rFonts w:hint="eastAsia"/>
+                <w:sz w:val="18"/>
+                <w:szCs w:val="18"/>
+              </w:rPr>
+              <w:t>○</w:t>
+            </w:r>
           </w:p>
         </w:tc>
         <w:tc>
@@ -3667,7 +3758,7 @@
                 <w:szCs w:val="12"/>
               </w:rPr>
               <w:pict w14:anchorId="052FA803">
-                <v:shape id="_x0000_i1035" type="#_x0000_t75" style="width:106.1pt;height:231.15pt;visibility:visible;mso-wrap-style:square">
+                <v:shape id="_x0000_i1035" type="#_x0000_t75" style="width:106.15pt;height:231pt;visibility:visible;mso-wrap-style:square">
                   <v:imagedata r:id="rId18" o:title=""/>
                 </v:shape>
               </w:pict>
@@ -3907,6 +3998,14 @@
                 <w:szCs w:val="12"/>
               </w:rPr>
             </w:pPr>
+            <w:r>
+              <w:rPr>
+                <w:rFonts w:hint="eastAsia"/>
+                <w:sz w:val="18"/>
+                <w:szCs w:val="18"/>
+              </w:rPr>
+              <w:t>○</w:t>
+            </w:r>
           </w:p>
         </w:tc>
         <w:tc>
@@ -4115,6 +4214,14 @@
                 <w:szCs w:val="12"/>
               </w:rPr>
             </w:pPr>
+            <w:r>
+              <w:rPr>
+                <w:rFonts w:hint="eastAsia"/>
+                <w:sz w:val="18"/>
+                <w:szCs w:val="18"/>
+              </w:rPr>
+              <w:t>○</w:t>
+            </w:r>
           </w:p>
         </w:tc>
         <w:tc>
@@ -4158,7 +4265,7 @@
                 <w:szCs w:val="12"/>
               </w:rPr>
               <w:pict w14:anchorId="31A6C6E9">
-                <v:shape id="_x0000_i1036" type="#_x0000_t75" style="width:106.1pt;height:227.35pt;visibility:visible;mso-wrap-style:square">
+                <v:shape id="_x0000_i1036" type="#_x0000_t75" style="width:106.15pt;height:227.25pt;visibility:visible;mso-wrap-style:square">
                   <v:imagedata r:id="rId19" o:title=""/>
                 </v:shape>
               </w:pict>
@@ -4196,7 +4303,7 @@
                 <w:szCs w:val="12"/>
               </w:rPr>
               <w:pict w14:anchorId="7E2E37FF">
-                <v:shape id="_x0000_i1037" type="#_x0000_t75" style="width:106.1pt;height:231.15pt;visibility:visible;mso-wrap-style:square">
+                <v:shape id="_x0000_i1037" type="#_x0000_t75" style="width:106.15pt;height:231pt;visibility:visible;mso-wrap-style:square">
                   <v:imagedata r:id="rId20" o:title=""/>
                 </v:shape>
               </w:pict>
@@ -4396,6 +4503,14 @@
                 <w:szCs w:val="12"/>
               </w:rPr>
             </w:pPr>
+            <w:r>
+              <w:rPr>
+                <w:rFonts w:hint="eastAsia"/>
+                <w:sz w:val="18"/>
+                <w:szCs w:val="18"/>
+              </w:rPr>
+              <w:t>○</w:t>
+            </w:r>
           </w:p>
         </w:tc>
         <w:tc>
@@ -4438,7 +4553,7 @@
                 <w:szCs w:val="12"/>
               </w:rPr>
               <w:pict w14:anchorId="376B24EC">
-                <v:shape id="_x0000_i1038" type="#_x0000_t75" style="width:106.1pt;height:64.4pt;visibility:visible;mso-wrap-style:square">
+                <v:shape id="_x0000_i1038" type="#_x0000_t75" style="width:105.75pt;height:64.5pt;visibility:visible;mso-wrap-style:square">
                   <v:imagedata r:id="rId21" o:title=""/>
                 </v:shape>
               </w:pict>
@@ -4639,6 +4754,14 @@
                 <w:szCs w:val="12"/>
               </w:rPr>
             </w:pPr>
+            <w:r>
+              <w:rPr>
+                <w:rFonts w:hint="eastAsia"/>
+                <w:sz w:val="18"/>
+                <w:szCs w:val="18"/>
+              </w:rPr>
+              <w:t>○</w:t>
+            </w:r>
           </w:p>
         </w:tc>
         <w:tc>
@@ -4681,7 +4804,7 @@
                 <w:szCs w:val="12"/>
               </w:rPr>
               <w:pict w14:anchorId="7F28E076">
-                <v:shape id="_x0000_i1039" type="#_x0000_t75" style="width:106.1pt;height:227.35pt;visibility:visible;mso-wrap-style:square">
+                <v:shape id="_x0000_i1039" type="#_x0000_t75" style="width:106.15pt;height:227.25pt;visibility:visible;mso-wrap-style:square">
                   <v:imagedata r:id="rId22" o:title=""/>
                 </v:shape>
               </w:pict>
@@ -5033,6 +5156,14 @@
                 <w:szCs w:val="12"/>
               </w:rPr>
             </w:pPr>
+            <w:r>
+              <w:rPr>
+                <w:rFonts w:hint="eastAsia"/>
+                <w:sz w:val="18"/>
+                <w:szCs w:val="18"/>
+              </w:rPr>
+              <w:t>○</w:t>
+            </w:r>
           </w:p>
         </w:tc>
         <w:tc>
@@ -5076,7 +5207,7 @@
                 <w:szCs w:val="12"/>
               </w:rPr>
               <w:pict w14:anchorId="6ED43FEC">
-                <v:shape id="_x0000_i1040" type="#_x0000_t75" style="width:106.1pt;height:238.75pt;visibility:visible;mso-wrap-style:square">
+                <v:shape id="_x0000_i1040" type="#_x0000_t75" style="width:106.15pt;height:238.9pt;visibility:visible;mso-wrap-style:square">
                   <v:imagedata r:id="rId23" o:title=""/>
                 </v:shape>
               </w:pict>
@@ -5116,7 +5247,7 @@
               </w:rPr>
               <w:lastRenderedPageBreak/>
               <w:pict w14:anchorId="2384C7EB">
-                <v:shape id="_x0000_i1041" type="#_x0000_t75" style="width:106.1pt;height:231.15pt;visibility:visible;mso-wrap-style:square">
+                <v:shape id="_x0000_i1041" type="#_x0000_t75" style="width:106.15pt;height:231pt;visibility:visible;mso-wrap-style:square">
                   <v:imagedata r:id="rId24" o:title=""/>
                 </v:shape>
               </w:pict>
@@ -5269,6 +5400,14 @@
                 <w:szCs w:val="12"/>
               </w:rPr>
             </w:pPr>
+            <w:r>
+              <w:rPr>
+                <w:rFonts w:hint="eastAsia"/>
+                <w:sz w:val="18"/>
+                <w:szCs w:val="18"/>
+              </w:rPr>
+              <w:t>○</w:t>
+            </w:r>
           </w:p>
         </w:tc>
         <w:tc>
@@ -5311,7 +5450,7 @@
                 <w:szCs w:val="12"/>
               </w:rPr>
               <w:pict w14:anchorId="20C1007E">
-                <v:shape id="_x0000_i1042" type="#_x0000_t75" style="width:106.1pt;height:223.6pt;visibility:visible;mso-wrap-style:square">
+                <v:shape id="_x0000_i1042" type="#_x0000_t75" style="width:106.15pt;height:223.5pt;visibility:visible;mso-wrap-style:square">
                   <v:imagedata r:id="rId25" o:title=""/>
                 </v:shape>
               </w:pict>
@@ -5500,6 +5639,14 @@
                 <w:szCs w:val="12"/>
               </w:rPr>
             </w:pPr>
+            <w:r>
+              <w:rPr>
+                <w:rFonts w:hint="eastAsia"/>
+                <w:sz w:val="18"/>
+                <w:szCs w:val="18"/>
+              </w:rPr>
+              <w:t>○</w:t>
+            </w:r>
           </w:p>
         </w:tc>
         <w:tc>
@@ -5555,7 +5702,7 @@
                 <w:szCs w:val="12"/>
               </w:rPr>
               <w:pict w14:anchorId="177C1A67">
-                <v:shape id="_x0000_i1043" type="#_x0000_t75" style="width:106.1pt;height:90.95pt;visibility:visible;mso-wrap-style:square">
+                <v:shape id="_x0000_i1043" type="#_x0000_t75" style="width:105.75pt;height:90.75pt;visibility:visible;mso-wrap-style:square">
                   <v:imagedata r:id="rId26" o:title=""/>
                 </v:shape>
               </w:pict>
@@ -5582,7 +5729,7 @@
                 <w:szCs w:val="12"/>
               </w:rPr>
               <w:pict w14:anchorId="259D21D7">
-                <v:shape id="_x0000_i1044" type="#_x0000_t75" style="width:106.1pt;height:79.6pt;visibility:visible;mso-wrap-style:square">
+                <v:shape id="_x0000_i1044" type="#_x0000_t75" style="width:105.75pt;height:79.5pt;visibility:visible;mso-wrap-style:square">
                   <v:imagedata r:id="rId27" o:title=""/>
                 </v:shape>
               </w:pict>
@@ -5620,7 +5767,7 @@
                 <w:szCs w:val="12"/>
               </w:rPr>
               <w:pict w14:anchorId="2B1F8E9E">
-                <v:shape id="_x0000_i1045" type="#_x0000_t75" style="width:106.1pt;height:68.2pt;visibility:visible;mso-wrap-style:square">
+                <v:shape id="_x0000_i1045" type="#_x0000_t75" style="width:105.75pt;height:67.9pt;visibility:visible;mso-wrap-style:square">
                   <v:imagedata r:id="rId28" o:title=""/>
                 </v:shape>
               </w:pict>
@@ -5691,6 +5838,19 @@
               </w:rPr>
               <w:t>4.</w:t>
             </w:r>
+            <w:r>
+              <w:rPr>
+                <w:rFonts w:hint="eastAsia"/>
+              </w:rPr>
+              <w:t xml:space="preserve"> </w:t>
+            </w:r>
+            <w:r>
+              <w:rPr>
+                <w:sz w:val="12"/>
+                <w:szCs w:val="12"/>
+              </w:rPr>
+              <w:t>검색 및 정렬 사용자 인터페이스</w:t>
+            </w:r>
           </w:p>
         </w:tc>
         <w:tc>
@@ -5704,6 +5864,139 @@
                 <w:szCs w:val="12"/>
               </w:rPr>
             </w:pPr>
+            <w:r>
+              <w:rPr>
+                <w:sz w:val="12"/>
+                <w:szCs w:val="12"/>
+              </w:rPr>
+              <w:t xml:space="preserve">사용자가 많은 게시물을 직접 스크롤하며 탐색하지 않고 원하는 게시물을 빠르게 찾을 수 있도록 검색 및 정렬 인터페이스를 구현하였다. 검색창에 키워드를 입력하면 Client가 해당 검색어를 PythonAnywhere의 REST API에 전달하고, 서버에서 제목과 본문을 기준으로 검색한 결과만 반환하도록 하였다. 또한 최신순, </w:t>
+            </w:r>
+            <w:proofErr w:type="spellStart"/>
+            <w:r>
+              <w:rPr>
+                <w:sz w:val="12"/>
+                <w:szCs w:val="12"/>
+              </w:rPr>
+              <w:t>오래된순</w:t>
+            </w:r>
+            <w:proofErr w:type="spellEnd"/>
+            <w:r>
+              <w:rPr>
+                <w:sz w:val="12"/>
+                <w:szCs w:val="12"/>
+              </w:rPr>
+              <w:t>, 제목순, 제목 역순 정렬을 선택할 수 있으며 검색과 정렬 조건을 동시에 적용할 수 있도록 구현하였다. 검색 결과 개수와 결과가 없는 상태도 화면에 표시하여 사용자가 현재 검색 상태를 쉽게 확인할 수 있도록 하였다.</w:t>
+            </w:r>
+          </w:p>
+          <w:p>
+            <w:pPr>
+              <w:rPr>
+                <w:sz w:val="12"/>
+                <w:szCs w:val="12"/>
+              </w:rPr>
+            </w:pPr>
+          </w:p>
+          <w:p>
+            <w:pPr>
+              <w:rPr>
+                <w:sz w:val="12"/>
+                <w:szCs w:val="12"/>
+              </w:rPr>
+            </w:pPr>
+            <w:r>
+              <w:rPr>
+                <w:rFonts w:hint="eastAsia"/>
+                <w:sz w:val="12"/>
+                <w:szCs w:val="12"/>
+              </w:rPr>
+              <w:t>1</w:t>
+            </w:r>
+            <w:r>
+              <w:rPr>
+                <w:sz w:val="12"/>
+                <w:szCs w:val="12"/>
+              </w:rPr>
+              <w:t xml:space="preserve"> 기본 게시물 목록: 서버에서 전달받은 게시물을 이미지, 제목, 본문, 게시일과 함께 표시하며 검색·정렬 기능을 사용할 수 있다.</w:t>
+            </w:r>
+          </w:p>
+          <w:p>
+            <w:pPr>
+              <w:rPr>
+                <w:sz w:val="12"/>
+                <w:szCs w:val="12"/>
+              </w:rPr>
+            </w:pPr>
+          </w:p>
+          <w:p>
+            <w:pPr>
+              <w:rPr>
+                <w:sz w:val="12"/>
+                <w:szCs w:val="12"/>
+              </w:rPr>
+            </w:pPr>
+            <w:r>
+              <w:rPr>
+                <w:rFonts w:hint="eastAsia"/>
+                <w:sz w:val="12"/>
+                <w:szCs w:val="12"/>
+              </w:rPr>
+              <w:t>2</w:t>
+            </w:r>
+            <w:r>
+              <w:rPr>
+                <w:sz w:val="12"/>
+                <w:szCs w:val="12"/>
+              </w:rPr>
+              <w:t xml:space="preserve"> 검색 결과: ‘제주’</w:t>
+            </w:r>
+            <w:proofErr w:type="spellStart"/>
+            <w:r>
+              <w:rPr>
+                <w:sz w:val="12"/>
+                <w:szCs w:val="12"/>
+              </w:rPr>
+              <w:t>를</w:t>
+            </w:r>
+            <w:proofErr w:type="spellEnd"/>
+            <w:r>
+              <w:rPr>
+                <w:sz w:val="12"/>
+                <w:szCs w:val="12"/>
+              </w:rPr>
+              <w:t xml:space="preserve"> 검색한 결과 제목 또는 본문에 해당 키워드가 포함된 게시물만 표시되고, 검색된 게시물 수가 함께 나타나는 것을 확인하였다.</w:t>
+            </w:r>
+          </w:p>
+          <w:p>
+            <w:pPr>
+              <w:rPr>
+                <w:sz w:val="12"/>
+                <w:szCs w:val="12"/>
+              </w:rPr>
+            </w:pPr>
+          </w:p>
+          <w:p>
+            <w:pPr>
+              <w:rPr>
+                <w:rFonts w:hint="eastAsia"/>
+                <w:sz w:val="12"/>
+                <w:szCs w:val="12"/>
+              </w:rPr>
+            </w:pPr>
+            <w:r>
+              <w:rPr>
+                <w:rFonts w:hint="eastAsia"/>
+                <w:sz w:val="12"/>
+                <w:szCs w:val="12"/>
+              </w:rPr>
+              <w:t>3</w:t>
+            </w:r>
+            <w:r>
+              <w:rPr>
+                <w:sz w:val="12"/>
+                <w:szCs w:val="12"/>
+              </w:rPr>
+              <w:t xml:space="preserve"> 정렬 결과: 검색 결과에 제목순 정렬을 적용하여 서버에서 반환된 게시물이 제목 기준으로 재배치되는 것을 확인하였다.</w:t>
+            </w:r>
           </w:p>
         </w:tc>
         <w:tc>
@@ -5719,6 +6012,14 @@
                 <w:szCs w:val="12"/>
               </w:rPr>
             </w:pPr>
+            <w:r>
+              <w:rPr>
+                <w:rFonts w:hint="eastAsia"/>
+                <w:sz w:val="18"/>
+                <w:szCs w:val="18"/>
+              </w:rPr>
+              <w:t>○</w:t>
+            </w:r>
           </w:p>
         </w:tc>
         <w:tc>
@@ -5745,12 +6046,82 @@
             <w:pPr>
               <w:rPr>
                 <w:rFonts w:cs="Times New Roman"/>
+                <w:noProof/>
                 <w:color w:val="auto"/>
                 <w:kern w:val="2"/>
                 <w:sz w:val="12"/>
                 <w:szCs w:val="12"/>
               </w:rPr>
             </w:pPr>
+            <w:r>
+              <w:rPr>
+                <w:rFonts w:cs="Times New Roman"/>
+                <w:noProof/>
+                <w:color w:val="auto"/>
+                <w:kern w:val="2"/>
+                <w:sz w:val="12"/>
+                <w:szCs w:val="12"/>
+              </w:rPr>
+              <w:pict w14:anchorId="35F7FDB0">
+                <v:shape id="_x0000_i1047" type="#_x0000_t75" style="width:105.75pt;height:227.65pt;visibility:visible;mso-wrap-style:square">
+                  <v:imagedata r:id="rId29" o:title=""/>
+                </v:shape>
+              </w:pict>
+            </w:r>
+          </w:p>
+          <w:p>
+            <w:pPr>
+              <w:rPr>
+                <w:rFonts w:cs="Times New Roman"/>
+                <w:noProof/>
+                <w:color w:val="auto"/>
+                <w:kern w:val="2"/>
+                <w:sz w:val="12"/>
+                <w:szCs w:val="12"/>
+              </w:rPr>
+            </w:pPr>
+            <w:r>
+              <w:rPr>
+                <w:rFonts w:cs="Times New Roman"/>
+                <w:noProof/>
+                <w:color w:val="auto"/>
+                <w:kern w:val="2"/>
+                <w:sz w:val="12"/>
+                <w:szCs w:val="12"/>
+              </w:rPr>
+              <w:pict w14:anchorId="24C7D47E">
+                <v:shape id="_x0000_i1048" type="#_x0000_t75" style="width:105.75pt;height:232.15pt;visibility:visible;mso-wrap-style:square">
+                  <v:imagedata r:id="rId30" o:title=""/>
+                </v:shape>
+              </w:pict>
+            </w:r>
+          </w:p>
+          <w:p>
+            <w:pPr>
+              <w:rPr>
+                <w:rFonts w:cs="Times New Roman"/>
+                <w:color w:val="auto"/>
+                <w:kern w:val="2"/>
+                <w:sz w:val="12"/>
+                <w:szCs w:val="12"/>
+              </w:rPr>
+            </w:pPr>
+            <w:r>
+              <w:rPr>
+                <w:rFonts w:cs="Times New Roman"/>
+                <w:noProof/>
+                <w:color w:val="auto"/>
+                <w:kern w:val="2"/>
+                <w:sz w:val="12"/>
+                <w:szCs w:val="12"/>
+              </w:rPr>
+              <w:lastRenderedPageBreak/>
+              <w:pict w14:anchorId="74DD7338">
+                <v:shape id="_x0000_i1049" type="#_x0000_t75" style="width:105.75pt;height:229.15pt;visibility:visible;mso-wrap-style:square">
+                  <v:imagedata r:id="rId31" o:title=""/>
+                </v:shape>
+              </w:pict>
+            </w:r>
           </w:p>
         </w:tc>
       </w:tr>
@@ -5777,6 +6148,7 @@
                 <w:sz w:val="12"/>
                 <w:szCs w:val="12"/>
               </w:rPr>
+              <w:lastRenderedPageBreak/>
               <w:t>18</w:t>
             </w:r>
           </w:p>
@@ -5804,7 +6176,6 @@
             <w:pPr>
               <w:jc w:val="left"/>
               <w:rPr>
-                <w:rFonts w:hint="eastAsia"/>
                 <w:sz w:val="12"/>
                 <w:szCs w:val="12"/>
               </w:rPr>
@@ -5860,6 +6231,14 @@
                 <w:szCs w:val="12"/>
               </w:rPr>
             </w:pPr>
+            <w:r>
+              <w:rPr>
+                <w:rFonts w:hint="eastAsia"/>
+                <w:sz w:val="18"/>
+                <w:szCs w:val="18"/>
+              </w:rPr>
+              <w:t>○</w:t>
+            </w:r>
           </w:p>
         </w:tc>
         <w:tc>
@@ -5902,8 +6281,8 @@
                 <w:szCs w:val="12"/>
               </w:rPr>
               <w:pict w14:anchorId="6CBF56FD">
-                <v:shape id="_x0000_i1046" type="#_x0000_t75" style="width:106.1pt;height:68.2pt;visibility:visible;mso-wrap-style:square">
-                  <v:imagedata r:id="rId29" o:title=""/>
+                <v:shape id="_x0000_i1046" type="#_x0000_t75" style="width:106.15pt;height:68.25pt;visibility:visible;mso-wrap-style:square">
+                  <v:imagedata r:id="rId32" o:title=""/>
                 </v:shape>
               </w:pict>
             </w:r>
@@ -5925,9 +6304,9 @@
       </w:pPr>
     </w:p>
     <w:sectPr>
-      <w:headerReference w:type="default" r:id="rId30"/>
-      <w:footerReference w:type="even" r:id="rId31"/>
-      <w:footerReference w:type="default" r:id="rId32"/>
+      <w:headerReference w:type="default" r:id="rId33"/>
+      <w:footerReference w:type="even" r:id="rId34"/>
+      <w:footerReference w:type="default" r:id="rId35"/>
       <w:footnotePr>
         <w:numRestart w:val="eachSect"/>
       </w:footnotePr>
@@ -6203,7 +6582,7 @@
         <v:path o:extrusionok="f" gradientshapeok="t" o:connecttype="rect"/>
         <o:lock v:ext="edit" aspectratio="t"/>
       </v:shapetype>
-      <v:shape id="_x0000_i1025" type="#_x0000_t75" style="width:7.6pt;height:7.6pt" o:bullet="t">
+      <v:shape id="_x0000_i1025" type="#_x0000_t75" style="width:7.5pt;height:7.5pt" o:bullet="t">
         <v:imagedata r:id="rId1" o:title="BD10267_"/>
       </v:shape>
     </w:pict>

</xml_diff>